<commit_message>
Versión Con modificaciones en el historial y dasboard
</commit_message>
<xml_diff>
--- a/public/assets/docs/seguimiento.docx
+++ b/public/assets/docs/seguimiento.docx
@@ -1,6 +1,6 @@
 
 <file path=word/document.xml><?xml version="1.0" encoding="utf-8"?>
-<w:document xmlns:wpc="http://schemas.microsoft.com/office/word/2010/wordprocessingCanvas" xmlns:cx="http://schemas.microsoft.com/office/drawing/2014/chartex" xmlns:cx1="http://schemas.microsoft.com/office/drawing/2015/9/8/chartex" xmlns:cx2="http://schemas.microsoft.com/office/drawing/2015/10/21/chartex" xmlns:cx3="http://schemas.microsoft.com/office/drawing/2016/5/9/chartex" xmlns:cx4="http://schemas.microsoft.com/office/drawing/2016/5/10/chartex" xmlns:cx5="http://schemas.microsoft.com/office/drawing/2016/5/11/chartex" xmlns:cx6="http://schemas.microsoft.com/office/drawing/2016/5/12/chartex" xmlns:cx7="http://schemas.microsoft.com/office/drawing/2016/5/13/chartex" xmlns:cx8="http://schemas.microsoft.com/office/drawing/2016/5/14/chartex" xmlns:mc="http://schemas.openxmlformats.org/markup-compatibility/2006" xmlns:aink="http://schemas.microsoft.com/office/drawing/2016/ink" xmlns:am3d="http://schemas.microsoft.com/office/drawing/2017/model3d" xmlns:o="urn:schemas-microsoft-com:office:office" xmlns:r="http://schemas.openxmlformats.org/officeDocument/2006/relationships" xmlns:m="http://schemas.openxmlformats.org/officeDocument/2006/math" xmlns:v="urn:schemas-microsoft-com:vml" xmlns:wp14="http://schemas.microsoft.com/office/word/2010/wordprocessingDrawing" xmlns:wp="http://schemas.openxmlformats.org/drawingml/2006/wordprocessingDrawing" xmlns:w10="urn:schemas-microsoft-com:office:word" xmlns:w="http://schemas.openxmlformats.org/wordprocessingml/2006/main" xmlns:w14="http://schemas.microsoft.com/office/word/2010/wordml" xmlns:w15="http://schemas.microsoft.com/office/word/2012/wordml" xmlns:w16cid="http://schemas.microsoft.com/office/word/2016/wordml/cid" xmlns:w16se="http://schemas.microsoft.com/office/word/2015/wordml/symex" xmlns:wpg="http://schemas.microsoft.com/office/word/2010/wordprocessingGroup" xmlns:wpi="http://schemas.microsoft.com/office/word/2010/wordprocessingInk" xmlns:wne="http://schemas.microsoft.com/office/word/2006/wordml" xmlns:wps="http://schemas.microsoft.com/office/word/2010/wordprocessingShape" mc:Ignorable="w14 w15 w16se w16cid wp14">
+<w:document xmlns:wpc="http://schemas.microsoft.com/office/word/2010/wordprocessingCanvas" xmlns:cx="http://schemas.microsoft.com/office/drawing/2014/chartex" xmlns:cx1="http://schemas.microsoft.com/office/drawing/2015/9/8/chartex" xmlns:cx2="http://schemas.microsoft.com/office/drawing/2015/10/21/chartex" xmlns:cx3="http://schemas.microsoft.com/office/drawing/2016/5/9/chartex" xmlns:cx4="http://schemas.microsoft.com/office/drawing/2016/5/10/chartex" xmlns:cx5="http://schemas.microsoft.com/office/drawing/2016/5/11/chartex" xmlns:cx6="http://schemas.microsoft.com/office/drawing/2016/5/12/chartex" xmlns:cx7="http://schemas.microsoft.com/office/drawing/2016/5/13/chartex" xmlns:cx8="http://schemas.microsoft.com/office/drawing/2016/5/14/chartex" xmlns:mc="http://schemas.openxmlformats.org/markup-compatibility/2006" xmlns:aink="http://schemas.microsoft.com/office/drawing/2016/ink" xmlns:am3d="http://schemas.microsoft.com/office/drawing/2017/model3d" xmlns:o="urn:schemas-microsoft-com:office:office" xmlns:oel="http://schemas.microsoft.com/office/2019/extlst" xmlns:r="http://schemas.openxmlformats.org/officeDocument/2006/relationships" xmlns:m="http://schemas.openxmlformats.org/officeDocument/2006/math" xmlns:v="urn:schemas-microsoft-com:vml" xmlns:wp14="http://schemas.microsoft.com/office/word/2010/wordprocessingDrawing" xmlns:wp="http://schemas.openxmlformats.org/drawingml/2006/wordprocessingDrawing" xmlns:w10="urn:schemas-microsoft-com:office:word" xmlns:w="http://schemas.openxmlformats.org/wordprocessingml/2006/main" xmlns:w14="http://schemas.microsoft.com/office/word/2010/wordml" xmlns:w15="http://schemas.microsoft.com/office/word/2012/wordml" xmlns:w16cex="http://schemas.microsoft.com/office/word/2018/wordml/cex" xmlns:w16cid="http://schemas.microsoft.com/office/word/2016/wordml/cid" xmlns:w16="http://schemas.microsoft.com/office/word/2018/wordml" xmlns:w16du="http://schemas.microsoft.com/office/word/2023/wordml/word16du" xmlns:w16sdtdh="http://schemas.microsoft.com/office/word/2020/wordml/sdtdatahash" xmlns:w16sdtfl="http://schemas.microsoft.com/office/word/2024/wordml/sdtformatlock" xmlns:w16se="http://schemas.microsoft.com/office/word/2015/wordml/symex" xmlns:wpg="http://schemas.microsoft.com/office/word/2010/wordprocessingGroup" xmlns:wpi="http://schemas.microsoft.com/office/word/2010/wordprocessingInk" xmlns:wne="http://schemas.microsoft.com/office/word/2006/wordml" xmlns:wps="http://schemas.microsoft.com/office/word/2010/wordprocessingShape" mc:Ignorable="w14 w15 w16se w16cid w16 w16cex w16sdtdh w16sdtfl w16du wp14">
   <w:body>
     <w:p>
       <w:r>
@@ -77,9 +77,9 @@
                               <w:tblLook w:val="0000" w:firstRow="0" w:lastRow="0" w:firstColumn="0" w:lastColumn="0" w:noHBand="0" w:noVBand="0"/>
                             </w:tblPr>
                             <w:tblGrid>
-                              <w:gridCol w:w="2882"/>
-                              <w:gridCol w:w="5720"/>
-                              <w:gridCol w:w="2134"/>
+                              <w:gridCol w:w="2885"/>
+                              <w:gridCol w:w="5728"/>
+                              <w:gridCol w:w="2137"/>
                             </w:tblGrid>
                             <w:tr>
                               <w:trPr>
@@ -392,7 +392,7 @@
                 <v:stroke joinstyle="miter"/>
                 <v:path gradientshapeok="t" o:connecttype="rect"/>
               </v:shapetype>
-              <v:shape id="ctc1" o:spid="_x0000_s1026" type="#_x0000_t202" style="position:absolute;left:0;text-align:left;margin-left:0;margin-top:-28.35pt;width:581.1pt;height:131.55pt;z-index:251659264;visibility:visible;mso-wrap-style:square;mso-width-percent:0;mso-height-percent:0;mso-wrap-distance-left:9pt;mso-wrap-distance-top:0;mso-wrap-distance-right:9pt;mso-wrap-distance-bottom:0;mso-position-horizontal:center;mso-position-horizontal-relative:page;mso-position-vertical:absolute;mso-position-vertical-relative:margin;mso-width-percent:0;mso-height-percent:0;mso-width-relative:margin;mso-height-relative:margin;v-text-anchor:top" o:gfxdata="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" o:allowoverlap="f" fillcolor="white [3201]" stroked="f" strokeweight=".5pt">
+              <v:shape id="ctc1" o:spid="_x0000_s1026" type="#_x0000_t202" style="position:absolute;left:0;text-align:left;margin-left:0;margin-top:-28.35pt;width:581.1pt;height:131.55pt;z-index:251659264;visibility:visible;mso-wrap-style:square;mso-width-percent:0;mso-height-percent:0;mso-wrap-distance-left:9pt;mso-wrap-distance-top:0;mso-wrap-distance-right:9pt;mso-wrap-distance-bottom:0;mso-position-horizontal:center;mso-position-horizontal-relative:page;mso-position-vertical:absolute;mso-position-vertical-relative:margin;mso-width-percent:0;mso-height-percent:0;mso-width-relative:margin;mso-height-relative:margin;v-text-anchor:top" o:gfxdata="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" o:allowoverlap="f" fillcolor="white [3201]" stroked="f" strokeweight=".5pt">
                 <v:textbox>
                   <w:txbxContent>
                     <w:tbl>
@@ -414,9 +414,9 @@
                         <w:tblLook w:val="0000" w:firstRow="0" w:lastRow="0" w:firstColumn="0" w:lastColumn="0" w:noHBand="0" w:noVBand="0"/>
                       </w:tblPr>
                       <w:tblGrid>
-                        <w:gridCol w:w="2882"/>
-                        <w:gridCol w:w="5720"/>
-                        <w:gridCol w:w="2134"/>
+                        <w:gridCol w:w="2885"/>
+                        <w:gridCol w:w="5728"/>
+                        <w:gridCol w:w="2137"/>
                       </w:tblGrid>
                       <w:tr>
                         <w:trPr>
@@ -914,8 +914,6 @@
       <w:pPr>
         <w:jc w:val="center"/>
       </w:pPr>
-      <w:bookmarkStart w:id="2" w:name="_GoBack"/>
-      <w:bookmarkEnd w:id="2"/>
     </w:p>
     <w:p>
       <w:pPr>
@@ -1047,7 +1045,7 @@
                                       <w:szCs w:val="18"/>
                                     </w:rPr>
                                   </w:pPr>
-                                  <w:bookmarkStart w:id="3" w:name="_Hlk168652179"/>
+                                  <w:bookmarkStart w:id="2" w:name="_Hlk168652179"/>
                                   <w:r>
                                     <w:rPr>
                                       <w:rFonts w:ascii="Arial" w:hAnsi="Arial" w:cs="Arial"/>
@@ -1276,6 +1274,7 @@
                                     </w:rPr>
                                     <w:t xml:space="preserve"> </w:t>
                                   </w:r>
+                                  <w:proofErr w:type="spellStart"/>
                                   <w:r>
                                     <w:rPr>
                                       <w:rFonts w:ascii="Arial" w:hAnsi="Arial" w:cs="Arial"/>
@@ -1284,7 +1283,18 @@
                                       <w:sz w:val="18"/>
                                       <w:szCs w:val="18"/>
                                     </w:rPr>
-                                    <w:t>Alex León Tito</w:t>
+                                    <w:t>Msc</w:t>
+                                  </w:r>
+                                  <w:proofErr w:type="spellEnd"/>
+                                  <w:r>
+                                    <w:rPr>
+                                      <w:rFonts w:ascii="Arial" w:hAnsi="Arial" w:cs="Arial"/>
+                                      <w:b/>
+                                      <w:spacing w:val="-1"/>
+                                      <w:sz w:val="18"/>
+                                      <w:szCs w:val="18"/>
+                                    </w:rPr>
+                                    <w:t>. Jefferson Villarreal</w:t>
                                   </w:r>
                                 </w:p>
                               </w:tc>
@@ -1322,7 +1332,6 @@
                                     </w:rPr>
                                     <w:t xml:space="preserve"> </w:t>
                                   </w:r>
-                                  <w:proofErr w:type="spellStart"/>
                                   <w:r>
                                     <w:rPr>
                                       <w:rFonts w:ascii="Arial" w:hAnsi="Arial" w:cs="Arial"/>
@@ -1331,18 +1340,7 @@
                                       <w:sz w:val="18"/>
                                       <w:szCs w:val="18"/>
                                     </w:rPr>
-                                    <w:t>Msc</w:t>
-                                  </w:r>
-                                  <w:proofErr w:type="spellEnd"/>
-                                  <w:r>
-                                    <w:rPr>
-                                      <w:rFonts w:ascii="Arial" w:hAnsi="Arial" w:cs="Arial"/>
-                                      <w:b/>
-                                      <w:spacing w:val="-1"/>
-                                      <w:sz w:val="18"/>
-                                      <w:szCs w:val="18"/>
-                                    </w:rPr>
-                                    <w:t>. Jefferson Villarreal</w:t>
+                                    <w:t>Alex León Tito</w:t>
                                   </w:r>
                                 </w:p>
                               </w:tc>
@@ -1454,7 +1452,7 @@
                                       <w:spacing w:val="-2"/>
                                       <w:sz w:val="18"/>
                                     </w:rPr>
-                                    <w:t>Vicerrector</w:t>
+                                    <w:t>Gestor de Carreras</w:t>
                                   </w:r>
                                 </w:p>
                               </w:tc>
@@ -1499,12 +1497,12 @@
                                       <w:spacing w:val="-2"/>
                                       <w:sz w:val="18"/>
                                     </w:rPr>
-                                    <w:t>Gestor de Carreras</w:t>
+                                    <w:t>Vicerrector</w:t>
                                   </w:r>
                                 </w:p>
                               </w:tc>
                             </w:tr>
-                            <w:bookmarkEnd w:id="3"/>
+                            <w:bookmarkEnd w:id="2"/>
                           </w:tbl>
                           <w:p/>
                         </w:txbxContent>
@@ -1529,7 +1527,7 @@
           </mc:Choice>
           <mc:Fallback>
             <w:pict>
-              <v:shape w14:anchorId="37AD2730" id="_x0000_s1027" type="#_x0000_t202" style="position:absolute;left:0;text-align:left;margin-left:14pt;margin-top:595.35pt;width:566.9pt;height:127pt;z-index:251661312;visibility:visible;mso-wrap-style:square;mso-width-percent:0;mso-height-percent:0;mso-wrap-distance-left:9pt;mso-wrap-distance-top:0;mso-wrap-distance-right:9pt;mso-wrap-distance-bottom:0;mso-position-horizontal:absolute;mso-position-horizontal-relative:page;mso-position-vertical:absolute;mso-position-vertical-relative:margin;mso-width-percent:0;mso-height-percent:0;mso-width-relative:margin;mso-height-relative:margin;v-text-anchor:top" o:gfxdata="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" o:allowoverlap="f" fillcolor="white [3201]" stroked="f" strokeweight=".5pt">
+              <v:shape w14:anchorId="37AD2730" id="_x0000_s1027" type="#_x0000_t202" style="position:absolute;left:0;text-align:left;margin-left:14pt;margin-top:595.35pt;width:566.9pt;height:127pt;z-index:251661312;visibility:visible;mso-wrap-style:square;mso-width-percent:0;mso-height-percent:0;mso-wrap-distance-left:9pt;mso-wrap-distance-top:0;mso-wrap-distance-right:9pt;mso-wrap-distance-bottom:0;mso-position-horizontal:absolute;mso-position-horizontal-relative:page;mso-position-vertical:absolute;mso-position-vertical-relative:margin;mso-width-percent:0;mso-height-percent:0;mso-width-relative:margin;mso-height-relative:margin;v-text-anchor:top" o:gfxdata="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" o:allowoverlap="f" fillcolor="white [3201]" stroked="f" strokeweight=".5pt">
                 <v:textbox>
                   <w:txbxContent>
                     <w:tbl>
@@ -1573,7 +1571,7 @@
                                 <w:szCs w:val="18"/>
                               </w:rPr>
                             </w:pPr>
-                            <w:bookmarkStart w:id="4" w:name="_Hlk168652179"/>
+                            <w:bookmarkStart w:id="3" w:name="_Hlk168652179"/>
                             <w:r>
                               <w:rPr>
                                 <w:rFonts w:ascii="Arial" w:hAnsi="Arial" w:cs="Arial"/>
@@ -1802,6 +1800,7 @@
                               </w:rPr>
                               <w:t xml:space="preserve"> </w:t>
                             </w:r>
+                            <w:proofErr w:type="spellStart"/>
                             <w:r>
                               <w:rPr>
                                 <w:rFonts w:ascii="Arial" w:hAnsi="Arial" w:cs="Arial"/>
@@ -1810,7 +1809,18 @@
                                 <w:sz w:val="18"/>
                                 <w:szCs w:val="18"/>
                               </w:rPr>
-                              <w:t>Alex León Tito</w:t>
+                              <w:t>Msc</w:t>
+                            </w:r>
+                            <w:proofErr w:type="spellEnd"/>
+                            <w:r>
+                              <w:rPr>
+                                <w:rFonts w:ascii="Arial" w:hAnsi="Arial" w:cs="Arial"/>
+                                <w:b/>
+                                <w:spacing w:val="-1"/>
+                                <w:sz w:val="18"/>
+                                <w:szCs w:val="18"/>
+                              </w:rPr>
+                              <w:t>. Jefferson Villarreal</w:t>
                             </w:r>
                           </w:p>
                         </w:tc>
@@ -1848,7 +1858,6 @@
                               </w:rPr>
                               <w:t xml:space="preserve"> </w:t>
                             </w:r>
-                            <w:proofErr w:type="spellStart"/>
                             <w:r>
                               <w:rPr>
                                 <w:rFonts w:ascii="Arial" w:hAnsi="Arial" w:cs="Arial"/>
@@ -1857,18 +1866,7 @@
                                 <w:sz w:val="18"/>
                                 <w:szCs w:val="18"/>
                               </w:rPr>
-                              <w:t>Msc</w:t>
-                            </w:r>
-                            <w:proofErr w:type="spellEnd"/>
-                            <w:r>
-                              <w:rPr>
-                                <w:rFonts w:ascii="Arial" w:hAnsi="Arial" w:cs="Arial"/>
-                                <w:b/>
-                                <w:spacing w:val="-1"/>
-                                <w:sz w:val="18"/>
-                                <w:szCs w:val="18"/>
-                              </w:rPr>
-                              <w:t>. Jefferson Villarreal</w:t>
+                              <w:t>Alex León Tito</w:t>
                             </w:r>
                           </w:p>
                         </w:tc>
@@ -1980,7 +1978,7 @@
                                 <w:spacing w:val="-2"/>
                                 <w:sz w:val="18"/>
                               </w:rPr>
-                              <w:t>Vicerrector</w:t>
+                              <w:t>Gestor de Carreras</w:t>
                             </w:r>
                           </w:p>
                         </w:tc>
@@ -2025,12 +2023,12 @@
                                 <w:spacing w:val="-2"/>
                                 <w:sz w:val="18"/>
                               </w:rPr>
-                              <w:t>Gestor de Carreras</w:t>
+                              <w:t>Vicerrector</w:t>
                             </w:r>
                           </w:p>
                         </w:tc>
                       </w:tr>
-                      <w:bookmarkEnd w:id="4"/>
+                      <w:bookmarkEnd w:id="3"/>
                     </w:tbl>
                     <w:p/>
                   </w:txbxContent>
@@ -2366,23 +2364,7 @@
                 <w:rFonts w:ascii="Segoe UI Symbol" w:hAnsi="Segoe UI Symbol"/>
                 <w:sz w:val="24"/>
               </w:rPr>
-              <w:t>{#</w:t>
-            </w:r>
-            <w:proofErr w:type="gramStart"/>
-            <w:r>
-              <w:rPr>
-                <w:rFonts w:ascii="Segoe UI Symbol" w:hAnsi="Segoe UI Symbol"/>
-                <w:sz w:val="24"/>
-              </w:rPr>
-              <w:t>Tecnologia}☒</w:t>
-            </w:r>
-            <w:proofErr w:type="gramEnd"/>
-            <w:r>
-              <w:rPr>
-                <w:rFonts w:ascii="Segoe UI Symbol" w:hAnsi="Segoe UI Symbol"/>
-                <w:sz w:val="24"/>
-              </w:rPr>
-              <w:t>{/Tecnologia}{^Tecnologia}☐{/Tecnologia} Tecnología Universitaria{#Licenciatura}☒{/Licenciatura}{^Licenciatura}☐{/Licenciatura}Licenciatura{#Ingenieria}☒{/Ingenieria}{^Ingenieria}☐{/Ingenieria} Ingeniería{#Maestria}☒{/Maestria}{^Maestria}☐{/Maestria} Maestría</w:t>
+              <w:t>{#Tecnologia}☒{/Tecnologia}{^Tecnologia}☐{/Tecnologia} Tecnología Universitaria{#Licenciatura}☒{/Licenciatura}{^Licenciatura}☐{/Licenciatura}Licenciatura{#Ingenieria}☒{/Ingenieria}{^Ingenieria}☐{/Ingenieria} Ingeniería{#Maestria}☒{/Maestria}{^Maestria}☐{/Maestria} Maestría</w:t>
             </w:r>
           </w:p>
           <w:p>
@@ -2404,23 +2386,7 @@
                 <w:rFonts w:ascii="Segoe UI Symbol" w:hAnsi="Segoe UI Symbol"/>
                 <w:sz w:val="24"/>
               </w:rPr>
-              <w:t>{#</w:t>
-            </w:r>
-            <w:proofErr w:type="gramStart"/>
-            <w:r>
-              <w:rPr>
-                <w:rFonts w:ascii="Segoe UI Symbol" w:hAnsi="Segoe UI Symbol"/>
-                <w:sz w:val="24"/>
-              </w:rPr>
-              <w:t>Doctorado}☒</w:t>
-            </w:r>
-            <w:proofErr w:type="gramEnd"/>
-            <w:r>
-              <w:rPr>
-                <w:rFonts w:ascii="Segoe UI Symbol" w:hAnsi="Segoe UI Symbol"/>
-                <w:sz w:val="24"/>
-              </w:rPr>
-              <w:t>{/Doctorado}{^Doctorado}☐{/Doctorado} Doctorado</w:t>
+              <w:t>{#Doctorado}☒{/Doctorado}{^Doctorado}☐{/Doctorado} Doctorado</w:t>
             </w:r>
           </w:p>
         </w:tc>
@@ -2652,21 +2618,7 @@
               <w:rPr>
                 <w:rFonts w:ascii="Segoe UI Symbol" w:hAnsi="Segoe UI Symbol"/>
               </w:rPr>
-              <w:t>{#</w:t>
-            </w:r>
-            <w:proofErr w:type="gramStart"/>
-            <w:r>
-              <w:rPr>
-                <w:rFonts w:ascii="Segoe UI Symbol" w:hAnsi="Segoe UI Symbol"/>
-              </w:rPr>
-              <w:t>Presencial}☒</w:t>
-            </w:r>
-            <w:proofErr w:type="gramEnd"/>
-            <w:r>
-              <w:rPr>
-                <w:rFonts w:ascii="Segoe UI Symbol" w:hAnsi="Segoe UI Symbol"/>
-              </w:rPr>
-              <w:t>{/Presencial}{^Presencial}☐{/Presencial}Presencial{#Virtual}☒{/Virtual}{^Virtual}☐{/Virtual}Virtual{#Hibrida}☒{/Hibrida}{^Hibrida}☐{/Hibrida} Híbrida</w:t>
+              <w:t>{#Presencial}☒{/Presencial}{^Presencial}☐{/Presencial}Presencial{#Virtual}☒{/Virtual}{^Virtual}☐{/Virtual}Virtual{#Hibrida}☒{/Hibrida}{^Hibrida}☐{/Hibrida} Híbrida</w:t>
             </w:r>
           </w:p>
         </w:tc>
@@ -2800,21 +2752,7 @@
               <w:rPr>
                 <w:rFonts w:ascii="Segoe UI Symbol" w:hAnsi="Segoe UI Symbol"/>
               </w:rPr>
-              <w:t>{#</w:t>
-            </w:r>
-            <w:proofErr w:type="gramStart"/>
-            <w:r>
-              <w:rPr>
-                <w:rFonts w:ascii="Segoe UI Symbol" w:hAnsi="Segoe UI Symbol"/>
-              </w:rPr>
-              <w:t>Total}☒</w:t>
-            </w:r>
-            <w:proofErr w:type="gramEnd"/>
-            <w:r>
-              <w:rPr>
-                <w:rFonts w:ascii="Segoe UI Symbol" w:hAnsi="Segoe UI Symbol"/>
-              </w:rPr>
-              <w:t>{/Total}{^Total}☐{/Total}Total{#Parcial}☒{/Parcial}{^Parcial}☐{/Parcial} Parcial{#NoAplica}☒{/NoAplica}{^NoAplica}☐{/NoAplica} No aplica</w:t>
+              <w:t>{#Total}☒{/Total}{^Total}☐{/Total}Total{#Parcial}☒{/Parcial}{^Parcial}☐{/Parcial} Parcial{#NoAplica}☒{/NoAplica}{^NoAplica}☐{/NoAplica} No aplica</w:t>
             </w:r>
           </w:p>
         </w:tc>
@@ -2859,21 +2797,7 @@
               <w:rPr>
                 <w:rFonts w:ascii="Segoe UI Symbol" w:hAnsi="Segoe UI Symbol"/>
               </w:rPr>
-              <w:t>{#</w:t>
-            </w:r>
-            <w:proofErr w:type="gramStart"/>
-            <w:r>
-              <w:rPr>
-                <w:rFonts w:ascii="Segoe UI Symbol" w:hAnsi="Segoe UI Symbol"/>
-              </w:rPr>
-              <w:t>Si}☒</w:t>
-            </w:r>
-            <w:proofErr w:type="gramEnd"/>
-            <w:r>
-              <w:rPr>
-                <w:rFonts w:ascii="Segoe UI Symbol" w:hAnsi="Segoe UI Symbol"/>
-              </w:rPr>
-              <w:t>{/Si}{^Si}☐{/Si} Sí{#No}☒{/No}{^No}☐{/No} No</w:t>
+              <w:t>{#Si}☒{/Si}{^Si}☐{/Si} Sí{#No}☒{/No}{^No}☐{/No} No</w:t>
             </w:r>
           </w:p>
         </w:tc>
@@ -2916,21 +2840,7 @@
               <w:rPr>
                 <w:rFonts w:ascii="Segoe UI Symbol" w:hAnsi="Segoe UI Symbol"/>
               </w:rPr>
-              <w:t>{#</w:t>
-            </w:r>
-            <w:proofErr w:type="gramStart"/>
-            <w:r>
-              <w:rPr>
-                <w:rFonts w:ascii="Segoe UI Symbol" w:hAnsi="Segoe UI Symbol"/>
-              </w:rPr>
-              <w:t>Economico}☒</w:t>
-            </w:r>
-            <w:proofErr w:type="gramEnd"/>
-            <w:r>
-              <w:rPr>
-                <w:rFonts w:ascii="Segoe UI Symbol" w:hAnsi="Segoe UI Symbol"/>
-              </w:rPr>
-              <w:t>{/Economico}{^Economico}☐{/Economico}Económico{#Tiempo}☒{/Tiempo}{^Tiempo}☐{/Tiempo} Con tiempo</w:t>
+              <w:t>{#Economico}☒{/Economico}{^Economico}☐{/Economico}Económico{#Tiempo}☒{/Tiempo}{^Tiempo}☐{/Tiempo} Con tiempo</w:t>
             </w:r>
           </w:p>
         </w:tc>
@@ -3711,7 +3621,7 @@
 </file>
 
 <file path=word/endnotes.xml><?xml version="1.0" encoding="utf-8"?>
-<w:endnotes xmlns:wpc="http://schemas.microsoft.com/office/word/2010/wordprocessingCanvas" xmlns:cx="http://schemas.microsoft.com/office/drawing/2014/chartex" xmlns:cx1="http://schemas.microsoft.com/office/drawing/2015/9/8/chartex" xmlns:cx2="http://schemas.microsoft.com/office/drawing/2015/10/21/chartex" xmlns:cx3="http://schemas.microsoft.com/office/drawing/2016/5/9/chartex" xmlns:cx4="http://schemas.microsoft.com/office/drawing/2016/5/10/chartex" xmlns:cx5="http://schemas.microsoft.com/office/drawing/2016/5/11/chartex" xmlns:cx6="http://schemas.microsoft.com/office/drawing/2016/5/12/chartex" xmlns:cx7="http://schemas.microsoft.com/office/drawing/2016/5/13/chartex" xmlns:cx8="http://schemas.microsoft.com/office/drawing/2016/5/14/chartex" xmlns:mc="http://schemas.openxmlformats.org/markup-compatibility/2006" xmlns:aink="http://schemas.microsoft.com/office/drawing/2016/ink" xmlns:am3d="http://schemas.microsoft.com/office/drawing/2017/model3d" xmlns:o="urn:schemas-microsoft-com:office:office" xmlns:r="http://schemas.openxmlformats.org/officeDocument/2006/relationships" xmlns:m="http://schemas.openxmlformats.org/officeDocument/2006/math" xmlns:v="urn:schemas-microsoft-com:vml" xmlns:wp14="http://schemas.microsoft.com/office/word/2010/wordprocessingDrawing" xmlns:wp="http://schemas.openxmlformats.org/drawingml/2006/wordprocessingDrawing" xmlns:w10="urn:schemas-microsoft-com:office:word" xmlns:w="http://schemas.openxmlformats.org/wordprocessingml/2006/main" xmlns:w14="http://schemas.microsoft.com/office/word/2010/wordml" xmlns:w15="http://schemas.microsoft.com/office/word/2012/wordml" xmlns:w16cid="http://schemas.microsoft.com/office/word/2016/wordml/cid" xmlns:w16se="http://schemas.microsoft.com/office/word/2015/wordml/symex" xmlns:wpg="http://schemas.microsoft.com/office/word/2010/wordprocessingGroup" xmlns:wpi="http://schemas.microsoft.com/office/word/2010/wordprocessingInk" xmlns:wne="http://schemas.microsoft.com/office/word/2006/wordml" xmlns:wps="http://schemas.microsoft.com/office/word/2010/wordprocessingShape" mc:Ignorable="w14 w15 w16se w16cid wp14">
+<w:endnotes xmlns:wpc="http://schemas.microsoft.com/office/word/2010/wordprocessingCanvas" xmlns:cx="http://schemas.microsoft.com/office/drawing/2014/chartex" xmlns:cx1="http://schemas.microsoft.com/office/drawing/2015/9/8/chartex" xmlns:cx2="http://schemas.microsoft.com/office/drawing/2015/10/21/chartex" xmlns:cx3="http://schemas.microsoft.com/office/drawing/2016/5/9/chartex" xmlns:cx4="http://schemas.microsoft.com/office/drawing/2016/5/10/chartex" xmlns:cx5="http://schemas.microsoft.com/office/drawing/2016/5/11/chartex" xmlns:cx6="http://schemas.microsoft.com/office/drawing/2016/5/12/chartex" xmlns:cx7="http://schemas.microsoft.com/office/drawing/2016/5/13/chartex" xmlns:cx8="http://schemas.microsoft.com/office/drawing/2016/5/14/chartex" xmlns:mc="http://schemas.openxmlformats.org/markup-compatibility/2006" xmlns:aink="http://schemas.microsoft.com/office/drawing/2016/ink" xmlns:am3d="http://schemas.microsoft.com/office/drawing/2017/model3d" xmlns:o="urn:schemas-microsoft-com:office:office" xmlns:oel="http://schemas.microsoft.com/office/2019/extlst" xmlns:r="http://schemas.openxmlformats.org/officeDocument/2006/relationships" xmlns:m="http://schemas.openxmlformats.org/officeDocument/2006/math" xmlns:v="urn:schemas-microsoft-com:vml" xmlns:wp14="http://schemas.microsoft.com/office/word/2010/wordprocessingDrawing" xmlns:wp="http://schemas.openxmlformats.org/drawingml/2006/wordprocessingDrawing" xmlns:w10="urn:schemas-microsoft-com:office:word" xmlns:w="http://schemas.openxmlformats.org/wordprocessingml/2006/main" xmlns:w14="http://schemas.microsoft.com/office/word/2010/wordml" xmlns:w15="http://schemas.microsoft.com/office/word/2012/wordml" xmlns:w16cex="http://schemas.microsoft.com/office/word/2018/wordml/cex" xmlns:w16cid="http://schemas.microsoft.com/office/word/2016/wordml/cid" xmlns:w16="http://schemas.microsoft.com/office/word/2018/wordml" xmlns:w16du="http://schemas.microsoft.com/office/word/2023/wordml/word16du" xmlns:w16sdtdh="http://schemas.microsoft.com/office/word/2020/wordml/sdtdatahash" xmlns:w16sdtfl="http://schemas.microsoft.com/office/word/2024/wordml/sdtformatlock" xmlns:w16se="http://schemas.microsoft.com/office/word/2015/wordml/symex" xmlns:wpg="http://schemas.microsoft.com/office/word/2010/wordprocessingGroup" xmlns:wpi="http://schemas.microsoft.com/office/word/2010/wordprocessingInk" xmlns:wne="http://schemas.microsoft.com/office/word/2006/wordml" xmlns:wps="http://schemas.microsoft.com/office/word/2010/wordprocessingShape" mc:Ignorable="w14 w15 w16se w16cid w16 w16cex w16sdtdh w16sdtfl w16du wp14">
   <w:endnote w:type="separator" w:id="-1">
     <w:p>
       <w:r>
@@ -3730,7 +3640,7 @@
 </file>
 
 <file path=word/footnotes.xml><?xml version="1.0" encoding="utf-8"?>
-<w:footnotes xmlns:wpc="http://schemas.microsoft.com/office/word/2010/wordprocessingCanvas" xmlns:cx="http://schemas.microsoft.com/office/drawing/2014/chartex" xmlns:cx1="http://schemas.microsoft.com/office/drawing/2015/9/8/chartex" xmlns:cx2="http://schemas.microsoft.com/office/drawing/2015/10/21/chartex" xmlns:cx3="http://schemas.microsoft.com/office/drawing/2016/5/9/chartex" xmlns:cx4="http://schemas.microsoft.com/office/drawing/2016/5/10/chartex" xmlns:cx5="http://schemas.microsoft.com/office/drawing/2016/5/11/chartex" xmlns:cx6="http://schemas.microsoft.com/office/drawing/2016/5/12/chartex" xmlns:cx7="http://schemas.microsoft.com/office/drawing/2016/5/13/chartex" xmlns:cx8="http://schemas.microsoft.com/office/drawing/2016/5/14/chartex" xmlns:mc="http://schemas.openxmlformats.org/markup-compatibility/2006" xmlns:aink="http://schemas.microsoft.com/office/drawing/2016/ink" xmlns:am3d="http://schemas.microsoft.com/office/drawing/2017/model3d" xmlns:o="urn:schemas-microsoft-com:office:office" xmlns:r="http://schemas.openxmlformats.org/officeDocument/2006/relationships" xmlns:m="http://schemas.openxmlformats.org/officeDocument/2006/math" xmlns:v="urn:schemas-microsoft-com:vml" xmlns:wp14="http://schemas.microsoft.com/office/word/2010/wordprocessingDrawing" xmlns:wp="http://schemas.openxmlformats.org/drawingml/2006/wordprocessingDrawing" xmlns:w10="urn:schemas-microsoft-com:office:word" xmlns:w="http://schemas.openxmlformats.org/wordprocessingml/2006/main" xmlns:w14="http://schemas.microsoft.com/office/word/2010/wordml" xmlns:w15="http://schemas.microsoft.com/office/word/2012/wordml" xmlns:w16cid="http://schemas.microsoft.com/office/word/2016/wordml/cid" xmlns:w16se="http://schemas.microsoft.com/office/word/2015/wordml/symex" xmlns:wpg="http://schemas.microsoft.com/office/word/2010/wordprocessingGroup" xmlns:wpi="http://schemas.microsoft.com/office/word/2010/wordprocessingInk" xmlns:wne="http://schemas.microsoft.com/office/word/2006/wordml" xmlns:wps="http://schemas.microsoft.com/office/word/2010/wordprocessingShape" mc:Ignorable="w14 w15 w16se w16cid wp14">
+<w:footnotes xmlns:wpc="http://schemas.microsoft.com/office/word/2010/wordprocessingCanvas" xmlns:cx="http://schemas.microsoft.com/office/drawing/2014/chartex" xmlns:cx1="http://schemas.microsoft.com/office/drawing/2015/9/8/chartex" xmlns:cx2="http://schemas.microsoft.com/office/drawing/2015/10/21/chartex" xmlns:cx3="http://schemas.microsoft.com/office/drawing/2016/5/9/chartex" xmlns:cx4="http://schemas.microsoft.com/office/drawing/2016/5/10/chartex" xmlns:cx5="http://schemas.microsoft.com/office/drawing/2016/5/11/chartex" xmlns:cx6="http://schemas.microsoft.com/office/drawing/2016/5/12/chartex" xmlns:cx7="http://schemas.microsoft.com/office/drawing/2016/5/13/chartex" xmlns:cx8="http://schemas.microsoft.com/office/drawing/2016/5/14/chartex" xmlns:mc="http://schemas.openxmlformats.org/markup-compatibility/2006" xmlns:aink="http://schemas.microsoft.com/office/drawing/2016/ink" xmlns:am3d="http://schemas.microsoft.com/office/drawing/2017/model3d" xmlns:o="urn:schemas-microsoft-com:office:office" xmlns:oel="http://schemas.microsoft.com/office/2019/extlst" xmlns:r="http://schemas.openxmlformats.org/officeDocument/2006/relationships" xmlns:m="http://schemas.openxmlformats.org/officeDocument/2006/math" xmlns:v="urn:schemas-microsoft-com:vml" xmlns:wp14="http://schemas.microsoft.com/office/word/2010/wordprocessingDrawing" xmlns:wp="http://schemas.openxmlformats.org/drawingml/2006/wordprocessingDrawing" xmlns:w10="urn:schemas-microsoft-com:office:word" xmlns:w="http://schemas.openxmlformats.org/wordprocessingml/2006/main" xmlns:w14="http://schemas.microsoft.com/office/word/2010/wordml" xmlns:w15="http://schemas.microsoft.com/office/word/2012/wordml" xmlns:w16cex="http://schemas.microsoft.com/office/word/2018/wordml/cex" xmlns:w16cid="http://schemas.microsoft.com/office/word/2016/wordml/cid" xmlns:w16="http://schemas.microsoft.com/office/word/2018/wordml" xmlns:w16du="http://schemas.microsoft.com/office/word/2023/wordml/word16du" xmlns:w16sdtdh="http://schemas.microsoft.com/office/word/2020/wordml/sdtdatahash" xmlns:w16sdtfl="http://schemas.microsoft.com/office/word/2024/wordml/sdtformatlock" xmlns:w16se="http://schemas.microsoft.com/office/word/2015/wordml/symex" xmlns:wpg="http://schemas.microsoft.com/office/word/2010/wordprocessingGroup" xmlns:wpi="http://schemas.microsoft.com/office/word/2010/wordprocessingInk" xmlns:wne="http://schemas.microsoft.com/office/word/2006/wordml" xmlns:wps="http://schemas.microsoft.com/office/word/2010/wordprocessingShape" mc:Ignorable="w14 w15 w16se w16cid w16 w16cex w16sdtdh w16sdtfl w16du wp14">
   <w:footnote w:type="separator" w:id="-1">
     <w:p>
       <w:r>
@@ -3749,7 +3659,7 @@
 </file>
 
 <file path=word/header1.xml><?xml version="1.0" encoding="utf-8"?>
-<w:hdr xmlns:wpc="http://schemas.microsoft.com/office/word/2010/wordprocessingCanvas" xmlns:cx="http://schemas.microsoft.com/office/drawing/2014/chartex" xmlns:cx1="http://schemas.microsoft.com/office/drawing/2015/9/8/chartex" xmlns:cx2="http://schemas.microsoft.com/office/drawing/2015/10/21/chartex" xmlns:cx3="http://schemas.microsoft.com/office/drawing/2016/5/9/chartex" xmlns:cx4="http://schemas.microsoft.com/office/drawing/2016/5/10/chartex" xmlns:cx5="http://schemas.microsoft.com/office/drawing/2016/5/11/chartex" xmlns:cx6="http://schemas.microsoft.com/office/drawing/2016/5/12/chartex" xmlns:cx7="http://schemas.microsoft.com/office/drawing/2016/5/13/chartex" xmlns:cx8="http://schemas.microsoft.com/office/drawing/2016/5/14/chartex" xmlns:mc="http://schemas.openxmlformats.org/markup-compatibility/2006" xmlns:aink="http://schemas.microsoft.com/office/drawing/2016/ink" xmlns:am3d="http://schemas.microsoft.com/office/drawing/2017/model3d" xmlns:o="urn:schemas-microsoft-com:office:office" xmlns:r="http://schemas.openxmlformats.org/officeDocument/2006/relationships" xmlns:m="http://schemas.openxmlformats.org/officeDocument/2006/math" xmlns:v="urn:schemas-microsoft-com:vml" xmlns:wp14="http://schemas.microsoft.com/office/word/2010/wordprocessingDrawing" xmlns:wp="http://schemas.openxmlformats.org/drawingml/2006/wordprocessingDrawing" xmlns:w10="urn:schemas-microsoft-com:office:word" xmlns:w="http://schemas.openxmlformats.org/wordprocessingml/2006/main" xmlns:w14="http://schemas.microsoft.com/office/word/2010/wordml" xmlns:w15="http://schemas.microsoft.com/office/word/2012/wordml" xmlns:w16cid="http://schemas.microsoft.com/office/word/2016/wordml/cid" xmlns:w16se="http://schemas.microsoft.com/office/word/2015/wordml/symex" xmlns:wpg="http://schemas.microsoft.com/office/word/2010/wordprocessingGroup" xmlns:wpi="http://schemas.microsoft.com/office/word/2010/wordprocessingInk" xmlns:wne="http://schemas.microsoft.com/office/word/2006/wordml" xmlns:wps="http://schemas.microsoft.com/office/word/2010/wordprocessingShape" mc:Ignorable="w14 w15 w16se w16cid wp14">
+<w:hdr xmlns:wpc="http://schemas.microsoft.com/office/word/2010/wordprocessingCanvas" xmlns:cx="http://schemas.microsoft.com/office/drawing/2014/chartex" xmlns:cx1="http://schemas.microsoft.com/office/drawing/2015/9/8/chartex" xmlns:cx2="http://schemas.microsoft.com/office/drawing/2015/10/21/chartex" xmlns:cx3="http://schemas.microsoft.com/office/drawing/2016/5/9/chartex" xmlns:cx4="http://schemas.microsoft.com/office/drawing/2016/5/10/chartex" xmlns:cx5="http://schemas.microsoft.com/office/drawing/2016/5/11/chartex" xmlns:cx6="http://schemas.microsoft.com/office/drawing/2016/5/12/chartex" xmlns:cx7="http://schemas.microsoft.com/office/drawing/2016/5/13/chartex" xmlns:cx8="http://schemas.microsoft.com/office/drawing/2016/5/14/chartex" xmlns:mc="http://schemas.openxmlformats.org/markup-compatibility/2006" xmlns:aink="http://schemas.microsoft.com/office/drawing/2016/ink" xmlns:am3d="http://schemas.microsoft.com/office/drawing/2017/model3d" xmlns:o="urn:schemas-microsoft-com:office:office" xmlns:oel="http://schemas.microsoft.com/office/2019/extlst" xmlns:r="http://schemas.openxmlformats.org/officeDocument/2006/relationships" xmlns:m="http://schemas.openxmlformats.org/officeDocument/2006/math" xmlns:v="urn:schemas-microsoft-com:vml" xmlns:wp14="http://schemas.microsoft.com/office/word/2010/wordprocessingDrawing" xmlns:wp="http://schemas.openxmlformats.org/drawingml/2006/wordprocessingDrawing" xmlns:w10="urn:schemas-microsoft-com:office:word" xmlns:w="http://schemas.openxmlformats.org/wordprocessingml/2006/main" xmlns:w14="http://schemas.microsoft.com/office/word/2010/wordml" xmlns:w15="http://schemas.microsoft.com/office/word/2012/wordml" xmlns:w16cex="http://schemas.microsoft.com/office/word/2018/wordml/cex" xmlns:w16cid="http://schemas.microsoft.com/office/word/2016/wordml/cid" xmlns:w16="http://schemas.microsoft.com/office/word/2018/wordml" xmlns:w16du="http://schemas.microsoft.com/office/word/2023/wordml/word16du" xmlns:w16sdtdh="http://schemas.microsoft.com/office/word/2020/wordml/sdtdatahash" xmlns:w16sdtfl="http://schemas.microsoft.com/office/word/2024/wordml/sdtformatlock" xmlns:w16se="http://schemas.microsoft.com/office/word/2015/wordml/symex" xmlns:wpg="http://schemas.microsoft.com/office/word/2010/wordprocessingGroup" xmlns:wpi="http://schemas.microsoft.com/office/word/2010/wordprocessingInk" xmlns:wne="http://schemas.microsoft.com/office/word/2006/wordml" xmlns:wps="http://schemas.microsoft.com/office/word/2010/wordprocessingShape" mc:Ignorable="w14 w15 w16se w16cid w16 w16cex w16sdtdh w16sdtfl w16du wp14">
   <w:p>
     <w:pPr>
       <w:pStyle w:val="Encabezado"/>
@@ -3828,9 +3738,9 @@
                             <w:tblLook w:val="0000" w:firstRow="0" w:lastRow="0" w:firstColumn="0" w:lastColumn="0" w:noHBand="0" w:noVBand="0"/>
                           </w:tblPr>
                           <w:tblGrid>
-                            <w:gridCol w:w="2882"/>
-                            <w:gridCol w:w="5720"/>
-                            <w:gridCol w:w="2134"/>
+                            <w:gridCol w:w="2885"/>
+                            <w:gridCol w:w="5728"/>
+                            <w:gridCol w:w="2137"/>
                           </w:tblGrid>
                           <w:tr>
                             <w:trPr>
@@ -4135,7 +4045,7 @@
               <v:stroke joinstyle="miter"/>
               <v:path gradientshapeok="t" o:connecttype="rect"/>
             </v:shapetype>
-            <v:shape id="_x0000_s1028" type="#_x0000_t202" style="position:absolute;left:0;text-align:left;margin-left:0;margin-top:-94.3pt;width:581.1pt;height:93.7pt;z-index:251659264;visibility:visible;mso-wrap-style:square;mso-width-percent:0;mso-height-percent:0;mso-wrap-distance-left:9pt;mso-wrap-distance-top:0;mso-wrap-distance-right:9pt;mso-wrap-distance-bottom:0;mso-position-horizontal:center;mso-position-horizontal-relative:margin;mso-position-vertical:absolute;mso-position-vertical-relative:margin;mso-width-percent:0;mso-height-percent:0;mso-width-relative:margin;mso-height-relative:margin;v-text-anchor:top" o:gfxdata="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" o:allowoverlap="f" fillcolor="white [3201]" stroked="f" strokeweight=".5pt">
+            <v:shape id="_x0000_s1028" type="#_x0000_t202" style="position:absolute;left:0;text-align:left;margin-left:0;margin-top:-94.3pt;width:581.1pt;height:93.7pt;z-index:251659264;visibility:visible;mso-wrap-style:square;mso-width-percent:0;mso-height-percent:0;mso-wrap-distance-left:9pt;mso-wrap-distance-top:0;mso-wrap-distance-right:9pt;mso-wrap-distance-bottom:0;mso-position-horizontal:center;mso-position-horizontal-relative:margin;mso-position-vertical:absolute;mso-position-vertical-relative:margin;mso-width-percent:0;mso-height-percent:0;mso-width-relative:margin;mso-height-relative:margin;v-text-anchor:top" o:gfxdata="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" o:allowoverlap="f" fillcolor="white [3201]" stroked="f" strokeweight=".5pt">
               <v:textbox>
                 <w:txbxContent>
                   <w:tbl>
@@ -4157,9 +4067,9 @@
                       <w:tblLook w:val="0000" w:firstRow="0" w:lastRow="0" w:firstColumn="0" w:lastColumn="0" w:noHBand="0" w:noVBand="0"/>
                     </w:tblPr>
                     <w:tblGrid>
-                      <w:gridCol w:w="2882"/>
-                      <w:gridCol w:w="5720"/>
-                      <w:gridCol w:w="2134"/>
+                      <w:gridCol w:w="2885"/>
+                      <w:gridCol w:w="5728"/>
+                      <w:gridCol w:w="2137"/>
                     </w:tblGrid>
                     <w:tr>
                       <w:trPr>
@@ -4472,7 +4382,7 @@
 </file>
 
 <file path=word/numbering.xml><?xml version="1.0" encoding="utf-8"?>
-<w:numbering xmlns:wpc="http://schemas.microsoft.com/office/word/2010/wordprocessingCanvas" xmlns:cx="http://schemas.microsoft.com/office/drawing/2014/chartex" xmlns:cx1="http://schemas.microsoft.com/office/drawing/2015/9/8/chartex" xmlns:cx2="http://schemas.microsoft.com/office/drawing/2015/10/21/chartex" xmlns:cx3="http://schemas.microsoft.com/office/drawing/2016/5/9/chartex" xmlns:cx4="http://schemas.microsoft.com/office/drawing/2016/5/10/chartex" xmlns:cx5="http://schemas.microsoft.com/office/drawing/2016/5/11/chartex" xmlns:cx6="http://schemas.microsoft.com/office/drawing/2016/5/12/chartex" xmlns:cx7="http://schemas.microsoft.com/office/drawing/2016/5/13/chartex" xmlns:cx8="http://schemas.microsoft.com/office/drawing/2016/5/14/chartex" xmlns:mc="http://schemas.openxmlformats.org/markup-compatibility/2006" xmlns:aink="http://schemas.microsoft.com/office/drawing/2016/ink" xmlns:am3d="http://schemas.microsoft.com/office/drawing/2017/model3d" xmlns:o="urn:schemas-microsoft-com:office:office" xmlns:r="http://schemas.openxmlformats.org/officeDocument/2006/relationships" xmlns:m="http://schemas.openxmlformats.org/officeDocument/2006/math" xmlns:v="urn:schemas-microsoft-com:vml" xmlns:wp14="http://schemas.microsoft.com/office/word/2010/wordprocessingDrawing" xmlns:wp="http://schemas.openxmlformats.org/drawingml/2006/wordprocessingDrawing" xmlns:w10="urn:schemas-microsoft-com:office:word" xmlns:w="http://schemas.openxmlformats.org/wordprocessingml/2006/main" xmlns:w14="http://schemas.microsoft.com/office/word/2010/wordml" xmlns:w15="http://schemas.microsoft.com/office/word/2012/wordml" xmlns:w16cid="http://schemas.microsoft.com/office/word/2016/wordml/cid" xmlns:w16se="http://schemas.microsoft.com/office/word/2015/wordml/symex" xmlns:wpg="http://schemas.microsoft.com/office/word/2010/wordprocessingGroup" xmlns:wpi="http://schemas.microsoft.com/office/word/2010/wordprocessingInk" xmlns:wne="http://schemas.microsoft.com/office/word/2006/wordml" xmlns:wps="http://schemas.microsoft.com/office/word/2010/wordprocessingShape" mc:Ignorable="w14 w15 w16se w16cid wp14">
+<w:numbering xmlns:wpc="http://schemas.microsoft.com/office/word/2010/wordprocessingCanvas" xmlns:cx="http://schemas.microsoft.com/office/drawing/2014/chartex" xmlns:cx1="http://schemas.microsoft.com/office/drawing/2015/9/8/chartex" xmlns:cx2="http://schemas.microsoft.com/office/drawing/2015/10/21/chartex" xmlns:cx3="http://schemas.microsoft.com/office/drawing/2016/5/9/chartex" xmlns:cx4="http://schemas.microsoft.com/office/drawing/2016/5/10/chartex" xmlns:cx5="http://schemas.microsoft.com/office/drawing/2016/5/11/chartex" xmlns:cx6="http://schemas.microsoft.com/office/drawing/2016/5/12/chartex" xmlns:cx7="http://schemas.microsoft.com/office/drawing/2016/5/13/chartex" xmlns:cx8="http://schemas.microsoft.com/office/drawing/2016/5/14/chartex" xmlns:mc="http://schemas.openxmlformats.org/markup-compatibility/2006" xmlns:aink="http://schemas.microsoft.com/office/drawing/2016/ink" xmlns:am3d="http://schemas.microsoft.com/office/drawing/2017/model3d" xmlns:o="urn:schemas-microsoft-com:office:office" xmlns:oel="http://schemas.microsoft.com/office/2019/extlst" xmlns:r="http://schemas.openxmlformats.org/officeDocument/2006/relationships" xmlns:m="http://schemas.openxmlformats.org/officeDocument/2006/math" xmlns:v="urn:schemas-microsoft-com:vml" xmlns:wp14="http://schemas.microsoft.com/office/word/2010/wordprocessingDrawing" xmlns:wp="http://schemas.openxmlformats.org/drawingml/2006/wordprocessingDrawing" xmlns:w10="urn:schemas-microsoft-com:office:word" xmlns:w="http://schemas.openxmlformats.org/wordprocessingml/2006/main" xmlns:w14="http://schemas.microsoft.com/office/word/2010/wordml" xmlns:w15="http://schemas.microsoft.com/office/word/2012/wordml" xmlns:w16cex="http://schemas.microsoft.com/office/word/2018/wordml/cex" xmlns:w16cid="http://schemas.microsoft.com/office/word/2016/wordml/cid" xmlns:w16="http://schemas.microsoft.com/office/word/2018/wordml" xmlns:w16du="http://schemas.microsoft.com/office/word/2023/wordml/word16du" xmlns:w16sdtdh="http://schemas.microsoft.com/office/word/2020/wordml/sdtdatahash" xmlns:w16sdtfl="http://schemas.microsoft.com/office/word/2024/wordml/sdtformatlock" xmlns:w16se="http://schemas.microsoft.com/office/word/2015/wordml/symex" xmlns:wpg="http://schemas.microsoft.com/office/word/2010/wordprocessingGroup" xmlns:wpi="http://schemas.microsoft.com/office/word/2010/wordprocessingInk" xmlns:wne="http://schemas.microsoft.com/office/word/2006/wordml" xmlns:wps="http://schemas.microsoft.com/office/word/2010/wordprocessingShape" mc:Ignorable="w14 w15 w16se w16cid w16 w16cex w16sdtdh w16sdtfl w16du wp14">
   <w:abstractNum w:abstractNumId="0" w15:restartNumberingAfterBreak="0">
     <w:nsid w:val="43264846"/>
     <w:multiLevelType w:val="hybridMultilevel"/>
@@ -4683,17 +4593,17 @@
       </w:pPr>
     </w:lvl>
   </w:abstractNum>
-  <w:num w:numId="1">
+  <w:num w:numId="1" w16cid:durableId="900823403">
     <w:abstractNumId w:val="1"/>
   </w:num>
-  <w:num w:numId="2">
+  <w:num w:numId="2" w16cid:durableId="79252808">
     <w:abstractNumId w:val="0"/>
   </w:num>
 </w:numbering>
 </file>
 
 <file path=word/styles.xml><?xml version="1.0" encoding="utf-8"?>
-<w:styles xmlns:mc="http://schemas.openxmlformats.org/markup-compatibility/2006" xmlns:r="http://schemas.openxmlformats.org/officeDocument/2006/relationships" xmlns:w="http://schemas.openxmlformats.org/wordprocessingml/2006/main" xmlns:w14="http://schemas.microsoft.com/office/word/2010/wordml" xmlns:w15="http://schemas.microsoft.com/office/word/2012/wordml" xmlns:w16cid="http://schemas.microsoft.com/office/word/2016/wordml/cid" xmlns:w16se="http://schemas.microsoft.com/office/word/2015/wordml/symex" mc:Ignorable="w14 w15 w16se w16cid">
+<w:styles xmlns:mc="http://schemas.openxmlformats.org/markup-compatibility/2006" xmlns:r="http://schemas.openxmlformats.org/officeDocument/2006/relationships" xmlns:w="http://schemas.openxmlformats.org/wordprocessingml/2006/main" xmlns:w14="http://schemas.microsoft.com/office/word/2010/wordml" xmlns:w15="http://schemas.microsoft.com/office/word/2012/wordml" xmlns:w16cex="http://schemas.microsoft.com/office/word/2018/wordml/cex" xmlns:w16cid="http://schemas.microsoft.com/office/word/2016/wordml/cid" xmlns:w16="http://schemas.microsoft.com/office/word/2018/wordml" xmlns:w16du="http://schemas.microsoft.com/office/word/2023/wordml/word16du" xmlns:w16sdtdh="http://schemas.microsoft.com/office/word/2020/wordml/sdtdatahash" xmlns:w16sdtfl="http://schemas.microsoft.com/office/word/2024/wordml/sdtformatlock" xmlns:w16se="http://schemas.microsoft.com/office/word/2015/wordml/symex" mc:Ignorable="w14 w15 w16se w16cid w16 w16cex w16sdtdh w16sdtfl w16du">
   <w:docDefaults>
     <w:rPrDefault>
       <w:rPr>
@@ -4709,7 +4619,7 @@
       </w:pPr>
     </w:pPrDefault>
   </w:docDefaults>
-  <w:latentStyles w:defLockedState="0" w:defUIPriority="99" w:defSemiHidden="0" w:defUnhideWhenUsed="0" w:defQFormat="0" w:count="375">
+  <w:latentStyles w:defLockedState="0" w:defUIPriority="99" w:defSemiHidden="0" w:defUnhideWhenUsed="0" w:defQFormat="0" w:count="376">
     <w:lsdException w:name="Normal" w:uiPriority="0" w:qFormat="1"/>
     <w:lsdException w:name="heading 1" w:uiPriority="9" w:qFormat="1"/>
     <w:lsdException w:name="heading 2" w:semiHidden="1" w:uiPriority="9" w:unhideWhenUsed="1" w:qFormat="1"/>
@@ -5085,6 +4995,7 @@
     <w:lsdException w:name="Smart Hyperlink" w:semiHidden="1" w:unhideWhenUsed="1"/>
     <w:lsdException w:name="Hashtag" w:semiHidden="1" w:unhideWhenUsed="1"/>
     <w:lsdException w:name="Unresolved Mention" w:semiHidden="1" w:unhideWhenUsed="1"/>
+    <w:lsdException w:name="Smart Link" w:semiHidden="1" w:unhideWhenUsed="1"/>
   </w:latentStyles>
   <w:style w:type="paragraph" w:default="1" w:styleId="Normal">
     <w:name w:val="Normal"/>
@@ -5632,26 +5543,6 @@
 </file>
 
 <file path=customXml/item1.xml><?xml version="1.0" encoding="utf-8"?>
-<?mso-contentType ?>
-<FormTemplates xmlns="http://schemas.microsoft.com/sharepoint/v3/contenttype/forms">
-  <Display>DocumentLibraryForm</Display>
-  <Edit>DocumentLibraryForm</Edit>
-  <New>DocumentLibraryForm</New>
-</FormTemplates>
-</file>
-
-<file path=customXml/item2.xml><?xml version="1.0" encoding="utf-8"?>
-<p:properties xmlns:p="http://schemas.microsoft.com/office/2006/metadata/properties" xmlns:xsi="http://www.w3.org/2001/XMLSchema-instance" xmlns:pc="http://schemas.microsoft.com/office/infopath/2007/PartnerControls">
-  <documentManagement>
-    <TaxCatchAll xmlns="27118ee3-1735-4bf8-b1d8-b92405a04e3d" xsi:nil="true"/>
-    <lcf76f155ced4ddcb4097134ff3c332f xmlns="99f51e6f-0b5b-434c-9b36-ed35023571bc">
-      <Terms xmlns="http://schemas.microsoft.com/office/infopath/2007/PartnerControls"/>
-    </lcf76f155ced4ddcb4097134ff3c332f>
-  </documentManagement>
-</p:properties>
-</file>
-
-<file path=customXml/item3.xml><?xml version="1.0" encoding="utf-8"?>
 <ct:contentTypeSchema xmlns:ct="http://schemas.microsoft.com/office/2006/metadata/contentType" xmlns:ma="http://schemas.microsoft.com/office/2006/metadata/properties/metaAttributes" ct:_="" ma:_="" ma:contentTypeName="Documento" ma:contentTypeID="0x010100AFCCB6245C987745891279558BDB0B3B" ma:contentTypeVersion="10" ma:contentTypeDescription="Crear nuevo documento." ma:contentTypeScope="" ma:versionID="db2b1ef01224d0e4c869899219de097e">
   <xsd:schema xmlns:xsd="http://www.w3.org/2001/XMLSchema" xmlns:xs="http://www.w3.org/2001/XMLSchema" xmlns:p="http://schemas.microsoft.com/office/2006/metadata/properties" xmlns:ns2="99f51e6f-0b5b-434c-9b36-ed35023571bc" xmlns:ns3="27118ee3-1735-4bf8-b1d8-b92405a04e3d" targetNamespace="http://schemas.microsoft.com/office/2006/metadata/properties" ma:root="true" ma:fieldsID="0535449ddeeed03297b3b93236c6a265" ns2:_="" ns3:_="">
     <xsd:import namespace="99f51e6f-0b5b-434c-9b36-ed35023571bc"/>
@@ -5840,10 +5731,41 @@
 </ct:contentTypeSchema>
 </file>
 
+<file path=customXml/item2.xml><?xml version="1.0" encoding="utf-8"?>
+<p:properties xmlns:p="http://schemas.microsoft.com/office/2006/metadata/properties" xmlns:xsi="http://www.w3.org/2001/XMLSchema-instance" xmlns:pc="http://schemas.microsoft.com/office/infopath/2007/PartnerControls">
+  <documentManagement>
+    <TaxCatchAll xmlns="27118ee3-1735-4bf8-b1d8-b92405a04e3d" xsi:nil="true"/>
+    <lcf76f155ced4ddcb4097134ff3c332f xmlns="99f51e6f-0b5b-434c-9b36-ed35023571bc">
+      <Terms xmlns="http://schemas.microsoft.com/office/infopath/2007/PartnerControls"/>
+    </lcf76f155ced4ddcb4097134ff3c332f>
+  </documentManagement>
+</p:properties>
+</file>
+
+<file path=customXml/item3.xml><?xml version="1.0" encoding="utf-8"?>
+<?mso-contentType ?>
+<FormTemplates xmlns="http://schemas.microsoft.com/sharepoint/v3/contenttype/forms">
+  <Display>DocumentLibraryForm</Display>
+  <Edit>DocumentLibraryForm</Edit>
+  <New>DocumentLibraryForm</New>
+</FormTemplates>
+</file>
+
 <file path=customXml/itemProps1.xml><?xml version="1.0" encoding="utf-8"?>
-<ds:datastoreItem xmlns:ds="http://schemas.openxmlformats.org/officeDocument/2006/customXml" ds:itemID="{44477994-AD16-4C5E-B397-6F8C2F21346D}">
+<ds:datastoreItem xmlns:ds="http://schemas.openxmlformats.org/officeDocument/2006/customXml" ds:itemID="{0BDD3A80-86CF-4900-80AE-E06463173716}">
   <ds:schemaRefs>
-    <ds:schemaRef ds:uri="http://schemas.microsoft.com/sharepoint/v3/contenttype/forms"/>
+    <ds:schemaRef ds:uri="http://schemas.microsoft.com/office/2006/metadata/contentType"/>
+    <ds:schemaRef ds:uri="http://schemas.microsoft.com/office/2006/metadata/properties/metaAttributes"/>
+    <ds:schemaRef ds:uri="http://www.w3.org/2001/XMLSchema"/>
+    <ds:schemaRef ds:uri="http://schemas.microsoft.com/office/2006/metadata/properties"/>
+    <ds:schemaRef ds:uri="99f51e6f-0b5b-434c-9b36-ed35023571bc"/>
+    <ds:schemaRef ds:uri="27118ee3-1735-4bf8-b1d8-b92405a04e3d"/>
+    <ds:schemaRef ds:uri="http://schemas.microsoft.com/office/2006/documentManagement/types"/>
+    <ds:schemaRef ds:uri="http://schemas.microsoft.com/office/infopath/2007/PartnerControls"/>
+    <ds:schemaRef ds:uri="http://schemas.openxmlformats.org/package/2006/metadata/core-properties"/>
+    <ds:schemaRef ds:uri="http://purl.org/dc/elements/1.1/"/>
+    <ds:schemaRef ds:uri="http://purl.org/dc/terms/"/>
+    <ds:schemaRef ds:uri="http://schemas.microsoft.com/internal/obd"/>
   </ds:schemaRefs>
 </ds:datastoreItem>
 </file>
@@ -5860,20 +5782,9 @@
 </file>
 
 <file path=customXml/itemProps3.xml><?xml version="1.0" encoding="utf-8"?>
-<ds:datastoreItem xmlns:ds="http://schemas.openxmlformats.org/officeDocument/2006/customXml" ds:itemID="{0BDD3A80-86CF-4900-80AE-E06463173716}">
+<ds:datastoreItem xmlns:ds="http://schemas.openxmlformats.org/officeDocument/2006/customXml" ds:itemID="{44477994-AD16-4C5E-B397-6F8C2F21346D}">
   <ds:schemaRefs>
-    <ds:schemaRef ds:uri="http://schemas.microsoft.com/office/2006/metadata/contentType"/>
-    <ds:schemaRef ds:uri="http://schemas.microsoft.com/office/2006/metadata/properties/metaAttributes"/>
-    <ds:schemaRef ds:uri="http://www.w3.org/2001/XMLSchema"/>
-    <ds:schemaRef ds:uri="http://schemas.microsoft.com/office/2006/metadata/properties"/>
-    <ds:schemaRef ds:uri="99f51e6f-0b5b-434c-9b36-ed35023571bc"/>
-    <ds:schemaRef ds:uri="27118ee3-1735-4bf8-b1d8-b92405a04e3d"/>
-    <ds:schemaRef ds:uri="http://schemas.microsoft.com/office/2006/documentManagement/types"/>
-    <ds:schemaRef ds:uri="http://schemas.microsoft.com/office/infopath/2007/PartnerControls"/>
-    <ds:schemaRef ds:uri="http://schemas.openxmlformats.org/package/2006/metadata/core-properties"/>
-    <ds:schemaRef ds:uri="http://purl.org/dc/elements/1.1/"/>
-    <ds:schemaRef ds:uri="http://purl.org/dc/terms/"/>
-    <ds:schemaRef ds:uri="http://schemas.microsoft.com/internal/obd"/>
+    <ds:schemaRef ds:uri="http://schemas.microsoft.com/sharepoint/v3/contenttype/forms"/>
   </ds:schemaRefs>
 </ds:datastoreItem>
 </file>
</xml_diff>

<commit_message>
Version con modificaciones en la documentación
</commit_message>
<xml_diff>
--- a/public/assets/docs/seguimiento.docx
+++ b/public/assets/docs/seguimiento.docx
@@ -1,6 +1,6 @@
 
 <file path=word/document.xml><?xml version="1.0" encoding="utf-8"?>
-<w:document xmlns:wpc="http://schemas.microsoft.com/office/word/2010/wordprocessingCanvas" xmlns:cx="http://schemas.microsoft.com/office/drawing/2014/chartex" xmlns:cx1="http://schemas.microsoft.com/office/drawing/2015/9/8/chartex" xmlns:cx2="http://schemas.microsoft.com/office/drawing/2015/10/21/chartex" xmlns:cx3="http://schemas.microsoft.com/office/drawing/2016/5/9/chartex" xmlns:cx4="http://schemas.microsoft.com/office/drawing/2016/5/10/chartex" xmlns:cx5="http://schemas.microsoft.com/office/drawing/2016/5/11/chartex" xmlns:cx6="http://schemas.microsoft.com/office/drawing/2016/5/12/chartex" xmlns:cx7="http://schemas.microsoft.com/office/drawing/2016/5/13/chartex" xmlns:cx8="http://schemas.microsoft.com/office/drawing/2016/5/14/chartex" xmlns:mc="http://schemas.openxmlformats.org/markup-compatibility/2006" xmlns:aink="http://schemas.microsoft.com/office/drawing/2016/ink" xmlns:am3d="http://schemas.microsoft.com/office/drawing/2017/model3d" xmlns:o="urn:schemas-microsoft-com:office:office" xmlns:oel="http://schemas.microsoft.com/office/2019/extlst" xmlns:r="http://schemas.openxmlformats.org/officeDocument/2006/relationships" xmlns:m="http://schemas.openxmlformats.org/officeDocument/2006/math" xmlns:v="urn:schemas-microsoft-com:vml" xmlns:wp14="http://schemas.microsoft.com/office/word/2010/wordprocessingDrawing" xmlns:wp="http://schemas.openxmlformats.org/drawingml/2006/wordprocessingDrawing" xmlns:w10="urn:schemas-microsoft-com:office:word" xmlns:w="http://schemas.openxmlformats.org/wordprocessingml/2006/main" xmlns:w14="http://schemas.microsoft.com/office/word/2010/wordml" xmlns:w15="http://schemas.microsoft.com/office/word/2012/wordml" xmlns:w16cex="http://schemas.microsoft.com/office/word/2018/wordml/cex" xmlns:w16cid="http://schemas.microsoft.com/office/word/2016/wordml/cid" xmlns:w16="http://schemas.microsoft.com/office/word/2018/wordml" xmlns:w16du="http://schemas.microsoft.com/office/word/2023/wordml/word16du" xmlns:w16sdtdh="http://schemas.microsoft.com/office/word/2020/wordml/sdtdatahash" xmlns:w16sdtfl="http://schemas.microsoft.com/office/word/2024/wordml/sdtformatlock" xmlns:w16se="http://schemas.microsoft.com/office/word/2015/wordml/symex" xmlns:wpg="http://schemas.microsoft.com/office/word/2010/wordprocessingGroup" xmlns:wpi="http://schemas.microsoft.com/office/word/2010/wordprocessingInk" xmlns:wne="http://schemas.microsoft.com/office/word/2006/wordml" xmlns:wps="http://schemas.microsoft.com/office/word/2010/wordprocessingShape" mc:Ignorable="w14 w15 w16se w16cid w16 w16cex w16sdtdh w16sdtfl w16du wp14">
+<w:document xmlns:wpc="http://schemas.microsoft.com/office/word/2010/wordprocessingCanvas" xmlns:cx="http://schemas.microsoft.com/office/drawing/2014/chartex" xmlns:cx1="http://schemas.microsoft.com/office/drawing/2015/9/8/chartex" xmlns:cx2="http://schemas.microsoft.com/office/drawing/2015/10/21/chartex" xmlns:cx3="http://schemas.microsoft.com/office/drawing/2016/5/9/chartex" xmlns:cx4="http://schemas.microsoft.com/office/drawing/2016/5/10/chartex" xmlns:cx5="http://schemas.microsoft.com/office/drawing/2016/5/11/chartex" xmlns:cx6="http://schemas.microsoft.com/office/drawing/2016/5/12/chartex" xmlns:cx7="http://schemas.microsoft.com/office/drawing/2016/5/13/chartex" xmlns:cx8="http://schemas.microsoft.com/office/drawing/2016/5/14/chartex" xmlns:mc="http://schemas.openxmlformats.org/markup-compatibility/2006" xmlns:aink="http://schemas.microsoft.com/office/drawing/2016/ink" xmlns:am3d="http://schemas.microsoft.com/office/drawing/2017/model3d" xmlns:o="urn:schemas-microsoft-com:office:office" xmlns:r="http://schemas.openxmlformats.org/officeDocument/2006/relationships" xmlns:m="http://schemas.openxmlformats.org/officeDocument/2006/math" xmlns:v="urn:schemas-microsoft-com:vml" xmlns:wp14="http://schemas.microsoft.com/office/word/2010/wordprocessingDrawing" xmlns:wp="http://schemas.openxmlformats.org/drawingml/2006/wordprocessingDrawing" xmlns:w10="urn:schemas-microsoft-com:office:word" xmlns:w="http://schemas.openxmlformats.org/wordprocessingml/2006/main" xmlns:w14="http://schemas.microsoft.com/office/word/2010/wordml" xmlns:w15="http://schemas.microsoft.com/office/word/2012/wordml" xmlns:w16cid="http://schemas.microsoft.com/office/word/2016/wordml/cid" xmlns:w16se="http://schemas.microsoft.com/office/word/2015/wordml/symex" xmlns:wpg="http://schemas.microsoft.com/office/word/2010/wordprocessingGroup" xmlns:wpi="http://schemas.microsoft.com/office/word/2010/wordprocessingInk" xmlns:wne="http://schemas.microsoft.com/office/word/2006/wordml" xmlns:wps="http://schemas.microsoft.com/office/word/2010/wordprocessingShape" mc:Ignorable="w14 w15 w16se w16cid wp14">
   <w:body>
     <w:p>
       <w:r>
@@ -77,9 +77,9 @@
                               <w:tblLook w:val="0000" w:firstRow="0" w:lastRow="0" w:firstColumn="0" w:lastColumn="0" w:noHBand="0" w:noVBand="0"/>
                             </w:tblPr>
                             <w:tblGrid>
-                              <w:gridCol w:w="2885"/>
-                              <w:gridCol w:w="5728"/>
-                              <w:gridCol w:w="2137"/>
+                              <w:gridCol w:w="2882"/>
+                              <w:gridCol w:w="5720"/>
+                              <w:gridCol w:w="2134"/>
                             </w:tblGrid>
                             <w:tr>
                               <w:trPr>
@@ -392,7 +392,7 @@
                 <v:stroke joinstyle="miter"/>
                 <v:path gradientshapeok="t" o:connecttype="rect"/>
               </v:shapetype>
-              <v:shape id="ctc1" o:spid="_x0000_s1026" type="#_x0000_t202" style="position:absolute;left:0;text-align:left;margin-left:0;margin-top:-28.35pt;width:581.1pt;height:131.55pt;z-index:251659264;visibility:visible;mso-wrap-style:square;mso-width-percent:0;mso-height-percent:0;mso-wrap-distance-left:9pt;mso-wrap-distance-top:0;mso-wrap-distance-right:9pt;mso-wrap-distance-bottom:0;mso-position-horizontal:center;mso-position-horizontal-relative:page;mso-position-vertical:absolute;mso-position-vertical-relative:margin;mso-width-percent:0;mso-height-percent:0;mso-width-relative:margin;mso-height-relative:margin;v-text-anchor:top" o:gfxdata="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" o:allowoverlap="f" fillcolor="white [3201]" stroked="f" strokeweight=".5pt">
+              <v:shape id="ctc1" o:spid="_x0000_s1026" type="#_x0000_t202" style="position:absolute;left:0;text-align:left;margin-left:0;margin-top:-28.35pt;width:581.1pt;height:131.55pt;z-index:251659264;visibility:visible;mso-wrap-style:square;mso-width-percent:0;mso-height-percent:0;mso-wrap-distance-left:9pt;mso-wrap-distance-top:0;mso-wrap-distance-right:9pt;mso-wrap-distance-bottom:0;mso-position-horizontal:center;mso-position-horizontal-relative:page;mso-position-vertical:absolute;mso-position-vertical-relative:margin;mso-width-percent:0;mso-height-percent:0;mso-width-relative:margin;mso-height-relative:margin;v-text-anchor:top" o:gfxdata="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" o:allowoverlap="f" fillcolor="white [3201]" stroked="f" strokeweight=".5pt">
                 <v:textbox>
                   <w:txbxContent>
                     <w:tbl>
@@ -414,9 +414,9 @@
                         <w:tblLook w:val="0000" w:firstRow="0" w:lastRow="0" w:firstColumn="0" w:lastColumn="0" w:noHBand="0" w:noVBand="0"/>
                       </w:tblPr>
                       <w:tblGrid>
-                        <w:gridCol w:w="2885"/>
-                        <w:gridCol w:w="5728"/>
-                        <w:gridCol w:w="2137"/>
+                        <w:gridCol w:w="2882"/>
+                        <w:gridCol w:w="5720"/>
+                        <w:gridCol w:w="2134"/>
                       </w:tblGrid>
                       <w:tr>
                         <w:trPr>
@@ -869,6 +869,8 @@
       <w:pPr>
         <w:jc w:val="center"/>
       </w:pPr>
+      <w:bookmarkStart w:id="2" w:name="_GoBack"/>
+      <w:bookmarkEnd w:id="2"/>
     </w:p>
     <w:p>
       <w:pPr>
@@ -1045,7 +1047,7 @@
                                       <w:szCs w:val="18"/>
                                     </w:rPr>
                                   </w:pPr>
-                                  <w:bookmarkStart w:id="2" w:name="_Hlk168652179"/>
+                                  <w:bookmarkStart w:id="3" w:name="_Hlk168652179"/>
                                   <w:r>
                                     <w:rPr>
                                       <w:rFonts w:ascii="Arial" w:hAnsi="Arial" w:cs="Arial"/>
@@ -1119,7 +1121,7 @@
                                       <w:sz w:val="18"/>
                                       <w:szCs w:val="18"/>
                                     </w:rPr>
-                                    <w:t>Revisado Por:</w:t>
+                                    <w:t>REVISADO POR:</w:t>
                                   </w:r>
                                 </w:p>
                               </w:tc>
@@ -1502,7 +1504,7 @@
                                 </w:p>
                               </w:tc>
                             </w:tr>
-                            <w:bookmarkEnd w:id="2"/>
+                            <w:bookmarkEnd w:id="3"/>
                           </w:tbl>
                           <w:p/>
                         </w:txbxContent>
@@ -1527,7 +1529,7 @@
           </mc:Choice>
           <mc:Fallback>
             <w:pict>
-              <v:shape w14:anchorId="37AD2730" id="_x0000_s1027" type="#_x0000_t202" style="position:absolute;left:0;text-align:left;margin-left:14pt;margin-top:595.35pt;width:566.9pt;height:127pt;z-index:251661312;visibility:visible;mso-wrap-style:square;mso-width-percent:0;mso-height-percent:0;mso-wrap-distance-left:9pt;mso-wrap-distance-top:0;mso-wrap-distance-right:9pt;mso-wrap-distance-bottom:0;mso-position-horizontal:absolute;mso-position-horizontal-relative:page;mso-position-vertical:absolute;mso-position-vertical-relative:margin;mso-width-percent:0;mso-height-percent:0;mso-width-relative:margin;mso-height-relative:margin;v-text-anchor:top" o:gfxdata="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" o:allowoverlap="f" fillcolor="white [3201]" stroked="f" strokeweight=".5pt">
+              <v:shape w14:anchorId="37AD2730" id="_x0000_s1027" type="#_x0000_t202" style="position:absolute;left:0;text-align:left;margin-left:14pt;margin-top:595.35pt;width:566.9pt;height:127pt;z-index:251661312;visibility:visible;mso-wrap-style:square;mso-width-percent:0;mso-height-percent:0;mso-wrap-distance-left:9pt;mso-wrap-distance-top:0;mso-wrap-distance-right:9pt;mso-wrap-distance-bottom:0;mso-position-horizontal:absolute;mso-position-horizontal-relative:page;mso-position-vertical:absolute;mso-position-vertical-relative:margin;mso-width-percent:0;mso-height-percent:0;mso-width-relative:margin;mso-height-relative:margin;v-text-anchor:top" o:gfxdata="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" o:allowoverlap="f" fillcolor="white [3201]" stroked="f" strokeweight=".5pt">
                 <v:textbox>
                   <w:txbxContent>
                     <w:tbl>
@@ -1571,7 +1573,7 @@
                                 <w:szCs w:val="18"/>
                               </w:rPr>
                             </w:pPr>
-                            <w:bookmarkStart w:id="3" w:name="_Hlk168652179"/>
+                            <w:bookmarkStart w:id="4" w:name="_Hlk168652179"/>
                             <w:r>
                               <w:rPr>
                                 <w:rFonts w:ascii="Arial" w:hAnsi="Arial" w:cs="Arial"/>
@@ -1645,7 +1647,7 @@
                                 <w:sz w:val="18"/>
                                 <w:szCs w:val="18"/>
                               </w:rPr>
-                              <w:t>Revisado Por:</w:t>
+                              <w:t>REVISADO POR:</w:t>
                             </w:r>
                           </w:p>
                         </w:tc>
@@ -2028,7 +2030,7 @@
                           </w:p>
                         </w:tc>
                       </w:tr>
-                      <w:bookmarkEnd w:id="3"/>
+                      <w:bookmarkEnd w:id="4"/>
                     </w:tbl>
                     <w:p/>
                   </w:txbxContent>
@@ -2364,7 +2366,23 @@
                 <w:rFonts w:ascii="Segoe UI Symbol" w:hAnsi="Segoe UI Symbol"/>
                 <w:sz w:val="24"/>
               </w:rPr>
-              <w:t>{#Tecnologia}☒{/Tecnologia}{^Tecnologia}☐{/Tecnologia} Tecnología Universitaria{#Licenciatura}☒{/Licenciatura}{^Licenciatura}☐{/Licenciatura}Licenciatura{#Ingenieria}☒{/Ingenieria}{^Ingenieria}☐{/Ingenieria} Ingeniería{#Maestria}☒{/Maestria}{^Maestria}☐{/Maestria} Maestría</w:t>
+              <w:t>{#</w:t>
+            </w:r>
+            <w:proofErr w:type="gramStart"/>
+            <w:r>
+              <w:rPr>
+                <w:rFonts w:ascii="Segoe UI Symbol" w:hAnsi="Segoe UI Symbol"/>
+                <w:sz w:val="24"/>
+              </w:rPr>
+              <w:t>Tecnologia}☒</w:t>
+            </w:r>
+            <w:proofErr w:type="gramEnd"/>
+            <w:r>
+              <w:rPr>
+                <w:rFonts w:ascii="Segoe UI Symbol" w:hAnsi="Segoe UI Symbol"/>
+                <w:sz w:val="24"/>
+              </w:rPr>
+              <w:t>{/Tecnologia}{^Tecnologia}☐{/Tecnologia} Tecnología Universitaria{#Licenciatura}☒{/Licenciatura}{^Licenciatura}☐{/Licenciatura}Licenciatura{#Ingenieria}☒{/Ingenieria}{^Ingenieria}☐{/Ingenieria} Ingeniería{#Maestria}☒{/Maestria}{^Maestria}☐{/Maestria} Maestría</w:t>
             </w:r>
           </w:p>
           <w:p>
@@ -2386,7 +2404,23 @@
                 <w:rFonts w:ascii="Segoe UI Symbol" w:hAnsi="Segoe UI Symbol"/>
                 <w:sz w:val="24"/>
               </w:rPr>
-              <w:t>{#Doctorado}☒{/Doctorado}{^Doctorado}☐{/Doctorado} Doctorado</w:t>
+              <w:t>{#</w:t>
+            </w:r>
+            <w:proofErr w:type="gramStart"/>
+            <w:r>
+              <w:rPr>
+                <w:rFonts w:ascii="Segoe UI Symbol" w:hAnsi="Segoe UI Symbol"/>
+                <w:sz w:val="24"/>
+              </w:rPr>
+              <w:t>Doctorado}☒</w:t>
+            </w:r>
+            <w:proofErr w:type="gramEnd"/>
+            <w:r>
+              <w:rPr>
+                <w:rFonts w:ascii="Segoe UI Symbol" w:hAnsi="Segoe UI Symbol"/>
+                <w:sz w:val="24"/>
+              </w:rPr>
+              <w:t>{/Doctorado}{^Doctorado}☐{/Doctorado} Doctorado</w:t>
             </w:r>
           </w:p>
         </w:tc>
@@ -2618,7 +2652,21 @@
               <w:rPr>
                 <w:rFonts w:ascii="Segoe UI Symbol" w:hAnsi="Segoe UI Symbol"/>
               </w:rPr>
-              <w:t>{#Presencial}☒{/Presencial}{^Presencial}☐{/Presencial}Presencial{#Virtual}☒{/Virtual}{^Virtual}☐{/Virtual}Virtual{#Hibrida}☒{/Hibrida}{^Hibrida}☐{/Hibrida} Híbrida</w:t>
+              <w:t>{#</w:t>
+            </w:r>
+            <w:proofErr w:type="gramStart"/>
+            <w:r>
+              <w:rPr>
+                <w:rFonts w:ascii="Segoe UI Symbol" w:hAnsi="Segoe UI Symbol"/>
+              </w:rPr>
+              <w:t>Presencial}☒</w:t>
+            </w:r>
+            <w:proofErr w:type="gramEnd"/>
+            <w:r>
+              <w:rPr>
+                <w:rFonts w:ascii="Segoe UI Symbol" w:hAnsi="Segoe UI Symbol"/>
+              </w:rPr>
+              <w:t>{/Presencial}{^Presencial}☐{/Presencial}Presencial{#Virtual}☒{/Virtual}{^Virtual}☐{/Virtual}Virtual{#Hibrida}☒{/Hibrida}{^Hibrida}☐{/Hibrida} Híbrida</w:t>
             </w:r>
           </w:p>
         </w:tc>
@@ -2752,7 +2800,21 @@
               <w:rPr>
                 <w:rFonts w:ascii="Segoe UI Symbol" w:hAnsi="Segoe UI Symbol"/>
               </w:rPr>
-              <w:t>{#Total}☒{/Total}{^Total}☐{/Total}Total{#Parcial}☒{/Parcial}{^Parcial}☐{/Parcial} Parcial{#NoAplica}☒{/NoAplica}{^NoAplica}☐{/NoAplica} No aplica</w:t>
+              <w:t>{#</w:t>
+            </w:r>
+            <w:proofErr w:type="gramStart"/>
+            <w:r>
+              <w:rPr>
+                <w:rFonts w:ascii="Segoe UI Symbol" w:hAnsi="Segoe UI Symbol"/>
+              </w:rPr>
+              <w:t>Total}☒</w:t>
+            </w:r>
+            <w:proofErr w:type="gramEnd"/>
+            <w:r>
+              <w:rPr>
+                <w:rFonts w:ascii="Segoe UI Symbol" w:hAnsi="Segoe UI Symbol"/>
+              </w:rPr>
+              <w:t>{/Total}{^Total}☐{/Total}Total{#Parcial}☒{/Parcial}{^Parcial}☐{/Parcial} Parcial{#NoAplica}☒{/NoAplica}{^NoAplica}☐{/NoAplica} No aplica</w:t>
             </w:r>
           </w:p>
         </w:tc>
@@ -2797,7 +2859,21 @@
               <w:rPr>
                 <w:rFonts w:ascii="Segoe UI Symbol" w:hAnsi="Segoe UI Symbol"/>
               </w:rPr>
-              <w:t>{#Si}☒{/Si}{^Si}☐{/Si} Sí{#No}☒{/No}{^No}☐{/No} No</w:t>
+              <w:t>{#</w:t>
+            </w:r>
+            <w:proofErr w:type="gramStart"/>
+            <w:r>
+              <w:rPr>
+                <w:rFonts w:ascii="Segoe UI Symbol" w:hAnsi="Segoe UI Symbol"/>
+              </w:rPr>
+              <w:t>Si}☒</w:t>
+            </w:r>
+            <w:proofErr w:type="gramEnd"/>
+            <w:r>
+              <w:rPr>
+                <w:rFonts w:ascii="Segoe UI Symbol" w:hAnsi="Segoe UI Symbol"/>
+              </w:rPr>
+              <w:t>{/Si}{^Si}☐{/Si} Sí{#No}☒{/No}{^No}☐{/No} No</w:t>
             </w:r>
           </w:p>
         </w:tc>
@@ -2840,7 +2916,21 @@
               <w:rPr>
                 <w:rFonts w:ascii="Segoe UI Symbol" w:hAnsi="Segoe UI Symbol"/>
               </w:rPr>
-              <w:t>{#Economico}☒{/Economico}{^Economico}☐{/Economico}Económico{#Tiempo}☒{/Tiempo}{^Tiempo}☐{/Tiempo} Con tiempo</w:t>
+              <w:t>{#</w:t>
+            </w:r>
+            <w:proofErr w:type="gramStart"/>
+            <w:r>
+              <w:rPr>
+                <w:rFonts w:ascii="Segoe UI Symbol" w:hAnsi="Segoe UI Symbol"/>
+              </w:rPr>
+              <w:t>Economico}☒</w:t>
+            </w:r>
+            <w:proofErr w:type="gramEnd"/>
+            <w:r>
+              <w:rPr>
+                <w:rFonts w:ascii="Segoe UI Symbol" w:hAnsi="Segoe UI Symbol"/>
+              </w:rPr>
+              <w:t>{/Economico}{^Economico}☐{/Economico}Económico{#Tiempo}☒{/Tiempo}{^Tiempo}☐{/Tiempo} Con tiempo</w:t>
             </w:r>
           </w:p>
         </w:tc>
@@ -3621,7 +3711,7 @@
 </file>
 
 <file path=word/endnotes.xml><?xml version="1.0" encoding="utf-8"?>
-<w:endnotes xmlns:wpc="http://schemas.microsoft.com/office/word/2010/wordprocessingCanvas" xmlns:cx="http://schemas.microsoft.com/office/drawing/2014/chartex" xmlns:cx1="http://schemas.microsoft.com/office/drawing/2015/9/8/chartex" xmlns:cx2="http://schemas.microsoft.com/office/drawing/2015/10/21/chartex" xmlns:cx3="http://schemas.microsoft.com/office/drawing/2016/5/9/chartex" xmlns:cx4="http://schemas.microsoft.com/office/drawing/2016/5/10/chartex" xmlns:cx5="http://schemas.microsoft.com/office/drawing/2016/5/11/chartex" xmlns:cx6="http://schemas.microsoft.com/office/drawing/2016/5/12/chartex" xmlns:cx7="http://schemas.microsoft.com/office/drawing/2016/5/13/chartex" xmlns:cx8="http://schemas.microsoft.com/office/drawing/2016/5/14/chartex" xmlns:mc="http://schemas.openxmlformats.org/markup-compatibility/2006" xmlns:aink="http://schemas.microsoft.com/office/drawing/2016/ink" xmlns:am3d="http://schemas.microsoft.com/office/drawing/2017/model3d" xmlns:o="urn:schemas-microsoft-com:office:office" xmlns:oel="http://schemas.microsoft.com/office/2019/extlst" xmlns:r="http://schemas.openxmlformats.org/officeDocument/2006/relationships" xmlns:m="http://schemas.openxmlformats.org/officeDocument/2006/math" xmlns:v="urn:schemas-microsoft-com:vml" xmlns:wp14="http://schemas.microsoft.com/office/word/2010/wordprocessingDrawing" xmlns:wp="http://schemas.openxmlformats.org/drawingml/2006/wordprocessingDrawing" xmlns:w10="urn:schemas-microsoft-com:office:word" xmlns:w="http://schemas.openxmlformats.org/wordprocessingml/2006/main" xmlns:w14="http://schemas.microsoft.com/office/word/2010/wordml" xmlns:w15="http://schemas.microsoft.com/office/word/2012/wordml" xmlns:w16cex="http://schemas.microsoft.com/office/word/2018/wordml/cex" xmlns:w16cid="http://schemas.microsoft.com/office/word/2016/wordml/cid" xmlns:w16="http://schemas.microsoft.com/office/word/2018/wordml" xmlns:w16du="http://schemas.microsoft.com/office/word/2023/wordml/word16du" xmlns:w16sdtdh="http://schemas.microsoft.com/office/word/2020/wordml/sdtdatahash" xmlns:w16sdtfl="http://schemas.microsoft.com/office/word/2024/wordml/sdtformatlock" xmlns:w16se="http://schemas.microsoft.com/office/word/2015/wordml/symex" xmlns:wpg="http://schemas.microsoft.com/office/word/2010/wordprocessingGroup" xmlns:wpi="http://schemas.microsoft.com/office/word/2010/wordprocessingInk" xmlns:wne="http://schemas.microsoft.com/office/word/2006/wordml" xmlns:wps="http://schemas.microsoft.com/office/word/2010/wordprocessingShape" mc:Ignorable="w14 w15 w16se w16cid w16 w16cex w16sdtdh w16sdtfl w16du wp14">
+<w:endnotes xmlns:wpc="http://schemas.microsoft.com/office/word/2010/wordprocessingCanvas" xmlns:cx="http://schemas.microsoft.com/office/drawing/2014/chartex" xmlns:cx1="http://schemas.microsoft.com/office/drawing/2015/9/8/chartex" xmlns:cx2="http://schemas.microsoft.com/office/drawing/2015/10/21/chartex" xmlns:cx3="http://schemas.microsoft.com/office/drawing/2016/5/9/chartex" xmlns:cx4="http://schemas.microsoft.com/office/drawing/2016/5/10/chartex" xmlns:cx5="http://schemas.microsoft.com/office/drawing/2016/5/11/chartex" xmlns:cx6="http://schemas.microsoft.com/office/drawing/2016/5/12/chartex" xmlns:cx7="http://schemas.microsoft.com/office/drawing/2016/5/13/chartex" xmlns:cx8="http://schemas.microsoft.com/office/drawing/2016/5/14/chartex" xmlns:mc="http://schemas.openxmlformats.org/markup-compatibility/2006" xmlns:aink="http://schemas.microsoft.com/office/drawing/2016/ink" xmlns:am3d="http://schemas.microsoft.com/office/drawing/2017/model3d" xmlns:o="urn:schemas-microsoft-com:office:office" xmlns:r="http://schemas.openxmlformats.org/officeDocument/2006/relationships" xmlns:m="http://schemas.openxmlformats.org/officeDocument/2006/math" xmlns:v="urn:schemas-microsoft-com:vml" xmlns:wp14="http://schemas.microsoft.com/office/word/2010/wordprocessingDrawing" xmlns:wp="http://schemas.openxmlformats.org/drawingml/2006/wordprocessingDrawing" xmlns:w10="urn:schemas-microsoft-com:office:word" xmlns:w="http://schemas.openxmlformats.org/wordprocessingml/2006/main" xmlns:w14="http://schemas.microsoft.com/office/word/2010/wordml" xmlns:w15="http://schemas.microsoft.com/office/word/2012/wordml" xmlns:w16cid="http://schemas.microsoft.com/office/word/2016/wordml/cid" xmlns:w16se="http://schemas.microsoft.com/office/word/2015/wordml/symex" xmlns:wpg="http://schemas.microsoft.com/office/word/2010/wordprocessingGroup" xmlns:wpi="http://schemas.microsoft.com/office/word/2010/wordprocessingInk" xmlns:wne="http://schemas.microsoft.com/office/word/2006/wordml" xmlns:wps="http://schemas.microsoft.com/office/word/2010/wordprocessingShape" mc:Ignorable="w14 w15 w16se w16cid wp14">
   <w:endnote w:type="separator" w:id="-1">
     <w:p>
       <w:r>
@@ -3640,7 +3730,7 @@
 </file>
 
 <file path=word/footnotes.xml><?xml version="1.0" encoding="utf-8"?>
-<w:footnotes xmlns:wpc="http://schemas.microsoft.com/office/word/2010/wordprocessingCanvas" xmlns:cx="http://schemas.microsoft.com/office/drawing/2014/chartex" xmlns:cx1="http://schemas.microsoft.com/office/drawing/2015/9/8/chartex" xmlns:cx2="http://schemas.microsoft.com/office/drawing/2015/10/21/chartex" xmlns:cx3="http://schemas.microsoft.com/office/drawing/2016/5/9/chartex" xmlns:cx4="http://schemas.microsoft.com/office/drawing/2016/5/10/chartex" xmlns:cx5="http://schemas.microsoft.com/office/drawing/2016/5/11/chartex" xmlns:cx6="http://schemas.microsoft.com/office/drawing/2016/5/12/chartex" xmlns:cx7="http://schemas.microsoft.com/office/drawing/2016/5/13/chartex" xmlns:cx8="http://schemas.microsoft.com/office/drawing/2016/5/14/chartex" xmlns:mc="http://schemas.openxmlformats.org/markup-compatibility/2006" xmlns:aink="http://schemas.microsoft.com/office/drawing/2016/ink" xmlns:am3d="http://schemas.microsoft.com/office/drawing/2017/model3d" xmlns:o="urn:schemas-microsoft-com:office:office" xmlns:oel="http://schemas.microsoft.com/office/2019/extlst" xmlns:r="http://schemas.openxmlformats.org/officeDocument/2006/relationships" xmlns:m="http://schemas.openxmlformats.org/officeDocument/2006/math" xmlns:v="urn:schemas-microsoft-com:vml" xmlns:wp14="http://schemas.microsoft.com/office/word/2010/wordprocessingDrawing" xmlns:wp="http://schemas.openxmlformats.org/drawingml/2006/wordprocessingDrawing" xmlns:w10="urn:schemas-microsoft-com:office:word" xmlns:w="http://schemas.openxmlformats.org/wordprocessingml/2006/main" xmlns:w14="http://schemas.microsoft.com/office/word/2010/wordml" xmlns:w15="http://schemas.microsoft.com/office/word/2012/wordml" xmlns:w16cex="http://schemas.microsoft.com/office/word/2018/wordml/cex" xmlns:w16cid="http://schemas.microsoft.com/office/word/2016/wordml/cid" xmlns:w16="http://schemas.microsoft.com/office/word/2018/wordml" xmlns:w16du="http://schemas.microsoft.com/office/word/2023/wordml/word16du" xmlns:w16sdtdh="http://schemas.microsoft.com/office/word/2020/wordml/sdtdatahash" xmlns:w16sdtfl="http://schemas.microsoft.com/office/word/2024/wordml/sdtformatlock" xmlns:w16se="http://schemas.microsoft.com/office/word/2015/wordml/symex" xmlns:wpg="http://schemas.microsoft.com/office/word/2010/wordprocessingGroup" xmlns:wpi="http://schemas.microsoft.com/office/word/2010/wordprocessingInk" xmlns:wne="http://schemas.microsoft.com/office/word/2006/wordml" xmlns:wps="http://schemas.microsoft.com/office/word/2010/wordprocessingShape" mc:Ignorable="w14 w15 w16se w16cid w16 w16cex w16sdtdh w16sdtfl w16du wp14">
+<w:footnotes xmlns:wpc="http://schemas.microsoft.com/office/word/2010/wordprocessingCanvas" xmlns:cx="http://schemas.microsoft.com/office/drawing/2014/chartex" xmlns:cx1="http://schemas.microsoft.com/office/drawing/2015/9/8/chartex" xmlns:cx2="http://schemas.microsoft.com/office/drawing/2015/10/21/chartex" xmlns:cx3="http://schemas.microsoft.com/office/drawing/2016/5/9/chartex" xmlns:cx4="http://schemas.microsoft.com/office/drawing/2016/5/10/chartex" xmlns:cx5="http://schemas.microsoft.com/office/drawing/2016/5/11/chartex" xmlns:cx6="http://schemas.microsoft.com/office/drawing/2016/5/12/chartex" xmlns:cx7="http://schemas.microsoft.com/office/drawing/2016/5/13/chartex" xmlns:cx8="http://schemas.microsoft.com/office/drawing/2016/5/14/chartex" xmlns:mc="http://schemas.openxmlformats.org/markup-compatibility/2006" xmlns:aink="http://schemas.microsoft.com/office/drawing/2016/ink" xmlns:am3d="http://schemas.microsoft.com/office/drawing/2017/model3d" xmlns:o="urn:schemas-microsoft-com:office:office" xmlns:r="http://schemas.openxmlformats.org/officeDocument/2006/relationships" xmlns:m="http://schemas.openxmlformats.org/officeDocument/2006/math" xmlns:v="urn:schemas-microsoft-com:vml" xmlns:wp14="http://schemas.microsoft.com/office/word/2010/wordprocessingDrawing" xmlns:wp="http://schemas.openxmlformats.org/drawingml/2006/wordprocessingDrawing" xmlns:w10="urn:schemas-microsoft-com:office:word" xmlns:w="http://schemas.openxmlformats.org/wordprocessingml/2006/main" xmlns:w14="http://schemas.microsoft.com/office/word/2010/wordml" xmlns:w15="http://schemas.microsoft.com/office/word/2012/wordml" xmlns:w16cid="http://schemas.microsoft.com/office/word/2016/wordml/cid" xmlns:w16se="http://schemas.microsoft.com/office/word/2015/wordml/symex" xmlns:wpg="http://schemas.microsoft.com/office/word/2010/wordprocessingGroup" xmlns:wpi="http://schemas.microsoft.com/office/word/2010/wordprocessingInk" xmlns:wne="http://schemas.microsoft.com/office/word/2006/wordml" xmlns:wps="http://schemas.microsoft.com/office/word/2010/wordprocessingShape" mc:Ignorable="w14 w15 w16se w16cid wp14">
   <w:footnote w:type="separator" w:id="-1">
     <w:p>
       <w:r>
@@ -3659,7 +3749,7 @@
 </file>
 
 <file path=word/header1.xml><?xml version="1.0" encoding="utf-8"?>
-<w:hdr xmlns:wpc="http://schemas.microsoft.com/office/word/2010/wordprocessingCanvas" xmlns:cx="http://schemas.microsoft.com/office/drawing/2014/chartex" xmlns:cx1="http://schemas.microsoft.com/office/drawing/2015/9/8/chartex" xmlns:cx2="http://schemas.microsoft.com/office/drawing/2015/10/21/chartex" xmlns:cx3="http://schemas.microsoft.com/office/drawing/2016/5/9/chartex" xmlns:cx4="http://schemas.microsoft.com/office/drawing/2016/5/10/chartex" xmlns:cx5="http://schemas.microsoft.com/office/drawing/2016/5/11/chartex" xmlns:cx6="http://schemas.microsoft.com/office/drawing/2016/5/12/chartex" xmlns:cx7="http://schemas.microsoft.com/office/drawing/2016/5/13/chartex" xmlns:cx8="http://schemas.microsoft.com/office/drawing/2016/5/14/chartex" xmlns:mc="http://schemas.openxmlformats.org/markup-compatibility/2006" xmlns:aink="http://schemas.microsoft.com/office/drawing/2016/ink" xmlns:am3d="http://schemas.microsoft.com/office/drawing/2017/model3d" xmlns:o="urn:schemas-microsoft-com:office:office" xmlns:oel="http://schemas.microsoft.com/office/2019/extlst" xmlns:r="http://schemas.openxmlformats.org/officeDocument/2006/relationships" xmlns:m="http://schemas.openxmlformats.org/officeDocument/2006/math" xmlns:v="urn:schemas-microsoft-com:vml" xmlns:wp14="http://schemas.microsoft.com/office/word/2010/wordprocessingDrawing" xmlns:wp="http://schemas.openxmlformats.org/drawingml/2006/wordprocessingDrawing" xmlns:w10="urn:schemas-microsoft-com:office:word" xmlns:w="http://schemas.openxmlformats.org/wordprocessingml/2006/main" xmlns:w14="http://schemas.microsoft.com/office/word/2010/wordml" xmlns:w15="http://schemas.microsoft.com/office/word/2012/wordml" xmlns:w16cex="http://schemas.microsoft.com/office/word/2018/wordml/cex" xmlns:w16cid="http://schemas.microsoft.com/office/word/2016/wordml/cid" xmlns:w16="http://schemas.microsoft.com/office/word/2018/wordml" xmlns:w16du="http://schemas.microsoft.com/office/word/2023/wordml/word16du" xmlns:w16sdtdh="http://schemas.microsoft.com/office/word/2020/wordml/sdtdatahash" xmlns:w16sdtfl="http://schemas.microsoft.com/office/word/2024/wordml/sdtformatlock" xmlns:w16se="http://schemas.microsoft.com/office/word/2015/wordml/symex" xmlns:wpg="http://schemas.microsoft.com/office/word/2010/wordprocessingGroup" xmlns:wpi="http://schemas.microsoft.com/office/word/2010/wordprocessingInk" xmlns:wne="http://schemas.microsoft.com/office/word/2006/wordml" xmlns:wps="http://schemas.microsoft.com/office/word/2010/wordprocessingShape" mc:Ignorable="w14 w15 w16se w16cid w16 w16cex w16sdtdh w16sdtfl w16du wp14">
+<w:hdr xmlns:wpc="http://schemas.microsoft.com/office/word/2010/wordprocessingCanvas" xmlns:cx="http://schemas.microsoft.com/office/drawing/2014/chartex" xmlns:cx1="http://schemas.microsoft.com/office/drawing/2015/9/8/chartex" xmlns:cx2="http://schemas.microsoft.com/office/drawing/2015/10/21/chartex" xmlns:cx3="http://schemas.microsoft.com/office/drawing/2016/5/9/chartex" xmlns:cx4="http://schemas.microsoft.com/office/drawing/2016/5/10/chartex" xmlns:cx5="http://schemas.microsoft.com/office/drawing/2016/5/11/chartex" xmlns:cx6="http://schemas.microsoft.com/office/drawing/2016/5/12/chartex" xmlns:cx7="http://schemas.microsoft.com/office/drawing/2016/5/13/chartex" xmlns:cx8="http://schemas.microsoft.com/office/drawing/2016/5/14/chartex" xmlns:mc="http://schemas.openxmlformats.org/markup-compatibility/2006" xmlns:aink="http://schemas.microsoft.com/office/drawing/2016/ink" xmlns:am3d="http://schemas.microsoft.com/office/drawing/2017/model3d" xmlns:o="urn:schemas-microsoft-com:office:office" xmlns:r="http://schemas.openxmlformats.org/officeDocument/2006/relationships" xmlns:m="http://schemas.openxmlformats.org/officeDocument/2006/math" xmlns:v="urn:schemas-microsoft-com:vml" xmlns:wp14="http://schemas.microsoft.com/office/word/2010/wordprocessingDrawing" xmlns:wp="http://schemas.openxmlformats.org/drawingml/2006/wordprocessingDrawing" xmlns:w10="urn:schemas-microsoft-com:office:word" xmlns:w="http://schemas.openxmlformats.org/wordprocessingml/2006/main" xmlns:w14="http://schemas.microsoft.com/office/word/2010/wordml" xmlns:w15="http://schemas.microsoft.com/office/word/2012/wordml" xmlns:w16cid="http://schemas.microsoft.com/office/word/2016/wordml/cid" xmlns:w16se="http://schemas.microsoft.com/office/word/2015/wordml/symex" xmlns:wpg="http://schemas.microsoft.com/office/word/2010/wordprocessingGroup" xmlns:wpi="http://schemas.microsoft.com/office/word/2010/wordprocessingInk" xmlns:wne="http://schemas.microsoft.com/office/word/2006/wordml" xmlns:wps="http://schemas.microsoft.com/office/word/2010/wordprocessingShape" mc:Ignorable="w14 w15 w16se w16cid wp14">
   <w:p>
     <w:pPr>
       <w:pStyle w:val="Encabezado"/>
@@ -3738,9 +3828,9 @@
                             <w:tblLook w:val="0000" w:firstRow="0" w:lastRow="0" w:firstColumn="0" w:lastColumn="0" w:noHBand="0" w:noVBand="0"/>
                           </w:tblPr>
                           <w:tblGrid>
-                            <w:gridCol w:w="2885"/>
-                            <w:gridCol w:w="5728"/>
-                            <w:gridCol w:w="2137"/>
+                            <w:gridCol w:w="2882"/>
+                            <w:gridCol w:w="5720"/>
+                            <w:gridCol w:w="2134"/>
                           </w:tblGrid>
                           <w:tr>
                             <w:trPr>
@@ -4045,7 +4135,7 @@
               <v:stroke joinstyle="miter"/>
               <v:path gradientshapeok="t" o:connecttype="rect"/>
             </v:shapetype>
-            <v:shape id="_x0000_s1028" type="#_x0000_t202" style="position:absolute;left:0;text-align:left;margin-left:0;margin-top:-94.3pt;width:581.1pt;height:93.7pt;z-index:251659264;visibility:visible;mso-wrap-style:square;mso-width-percent:0;mso-height-percent:0;mso-wrap-distance-left:9pt;mso-wrap-distance-top:0;mso-wrap-distance-right:9pt;mso-wrap-distance-bottom:0;mso-position-horizontal:center;mso-position-horizontal-relative:margin;mso-position-vertical:absolute;mso-position-vertical-relative:margin;mso-width-percent:0;mso-height-percent:0;mso-width-relative:margin;mso-height-relative:margin;v-text-anchor:top" o:gfxdata="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" o:allowoverlap="f" fillcolor="white [3201]" stroked="f" strokeweight=".5pt">
+            <v:shape id="_x0000_s1028" type="#_x0000_t202" style="position:absolute;left:0;text-align:left;margin-left:0;margin-top:-94.3pt;width:581.1pt;height:93.7pt;z-index:251659264;visibility:visible;mso-wrap-style:square;mso-width-percent:0;mso-height-percent:0;mso-wrap-distance-left:9pt;mso-wrap-distance-top:0;mso-wrap-distance-right:9pt;mso-wrap-distance-bottom:0;mso-position-horizontal:center;mso-position-horizontal-relative:margin;mso-position-vertical:absolute;mso-position-vertical-relative:margin;mso-width-percent:0;mso-height-percent:0;mso-width-relative:margin;mso-height-relative:margin;v-text-anchor:top" o:gfxdata="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" o:allowoverlap="f" fillcolor="white [3201]" stroked="f" strokeweight=".5pt">
               <v:textbox>
                 <w:txbxContent>
                   <w:tbl>
@@ -4067,9 +4157,9 @@
                       <w:tblLook w:val="0000" w:firstRow="0" w:lastRow="0" w:firstColumn="0" w:lastColumn="0" w:noHBand="0" w:noVBand="0"/>
                     </w:tblPr>
                     <w:tblGrid>
-                      <w:gridCol w:w="2885"/>
-                      <w:gridCol w:w="5728"/>
-                      <w:gridCol w:w="2137"/>
+                      <w:gridCol w:w="2882"/>
+                      <w:gridCol w:w="5720"/>
+                      <w:gridCol w:w="2134"/>
                     </w:tblGrid>
                     <w:tr>
                       <w:trPr>
@@ -4382,7 +4472,7 @@
 </file>
 
 <file path=word/numbering.xml><?xml version="1.0" encoding="utf-8"?>
-<w:numbering xmlns:wpc="http://schemas.microsoft.com/office/word/2010/wordprocessingCanvas" xmlns:cx="http://schemas.microsoft.com/office/drawing/2014/chartex" xmlns:cx1="http://schemas.microsoft.com/office/drawing/2015/9/8/chartex" xmlns:cx2="http://schemas.microsoft.com/office/drawing/2015/10/21/chartex" xmlns:cx3="http://schemas.microsoft.com/office/drawing/2016/5/9/chartex" xmlns:cx4="http://schemas.microsoft.com/office/drawing/2016/5/10/chartex" xmlns:cx5="http://schemas.microsoft.com/office/drawing/2016/5/11/chartex" xmlns:cx6="http://schemas.microsoft.com/office/drawing/2016/5/12/chartex" xmlns:cx7="http://schemas.microsoft.com/office/drawing/2016/5/13/chartex" xmlns:cx8="http://schemas.microsoft.com/office/drawing/2016/5/14/chartex" xmlns:mc="http://schemas.openxmlformats.org/markup-compatibility/2006" xmlns:aink="http://schemas.microsoft.com/office/drawing/2016/ink" xmlns:am3d="http://schemas.microsoft.com/office/drawing/2017/model3d" xmlns:o="urn:schemas-microsoft-com:office:office" xmlns:oel="http://schemas.microsoft.com/office/2019/extlst" xmlns:r="http://schemas.openxmlformats.org/officeDocument/2006/relationships" xmlns:m="http://schemas.openxmlformats.org/officeDocument/2006/math" xmlns:v="urn:schemas-microsoft-com:vml" xmlns:wp14="http://schemas.microsoft.com/office/word/2010/wordprocessingDrawing" xmlns:wp="http://schemas.openxmlformats.org/drawingml/2006/wordprocessingDrawing" xmlns:w10="urn:schemas-microsoft-com:office:word" xmlns:w="http://schemas.openxmlformats.org/wordprocessingml/2006/main" xmlns:w14="http://schemas.microsoft.com/office/word/2010/wordml" xmlns:w15="http://schemas.microsoft.com/office/word/2012/wordml" xmlns:w16cex="http://schemas.microsoft.com/office/word/2018/wordml/cex" xmlns:w16cid="http://schemas.microsoft.com/office/word/2016/wordml/cid" xmlns:w16="http://schemas.microsoft.com/office/word/2018/wordml" xmlns:w16du="http://schemas.microsoft.com/office/word/2023/wordml/word16du" xmlns:w16sdtdh="http://schemas.microsoft.com/office/word/2020/wordml/sdtdatahash" xmlns:w16sdtfl="http://schemas.microsoft.com/office/word/2024/wordml/sdtformatlock" xmlns:w16se="http://schemas.microsoft.com/office/word/2015/wordml/symex" xmlns:wpg="http://schemas.microsoft.com/office/word/2010/wordprocessingGroup" xmlns:wpi="http://schemas.microsoft.com/office/word/2010/wordprocessingInk" xmlns:wne="http://schemas.microsoft.com/office/word/2006/wordml" xmlns:wps="http://schemas.microsoft.com/office/word/2010/wordprocessingShape" mc:Ignorable="w14 w15 w16se w16cid w16 w16cex w16sdtdh w16sdtfl w16du wp14">
+<w:numbering xmlns:wpc="http://schemas.microsoft.com/office/word/2010/wordprocessingCanvas" xmlns:cx="http://schemas.microsoft.com/office/drawing/2014/chartex" xmlns:cx1="http://schemas.microsoft.com/office/drawing/2015/9/8/chartex" xmlns:cx2="http://schemas.microsoft.com/office/drawing/2015/10/21/chartex" xmlns:cx3="http://schemas.microsoft.com/office/drawing/2016/5/9/chartex" xmlns:cx4="http://schemas.microsoft.com/office/drawing/2016/5/10/chartex" xmlns:cx5="http://schemas.microsoft.com/office/drawing/2016/5/11/chartex" xmlns:cx6="http://schemas.microsoft.com/office/drawing/2016/5/12/chartex" xmlns:cx7="http://schemas.microsoft.com/office/drawing/2016/5/13/chartex" xmlns:cx8="http://schemas.microsoft.com/office/drawing/2016/5/14/chartex" xmlns:mc="http://schemas.openxmlformats.org/markup-compatibility/2006" xmlns:aink="http://schemas.microsoft.com/office/drawing/2016/ink" xmlns:am3d="http://schemas.microsoft.com/office/drawing/2017/model3d" xmlns:o="urn:schemas-microsoft-com:office:office" xmlns:r="http://schemas.openxmlformats.org/officeDocument/2006/relationships" xmlns:m="http://schemas.openxmlformats.org/officeDocument/2006/math" xmlns:v="urn:schemas-microsoft-com:vml" xmlns:wp14="http://schemas.microsoft.com/office/word/2010/wordprocessingDrawing" xmlns:wp="http://schemas.openxmlformats.org/drawingml/2006/wordprocessingDrawing" xmlns:w10="urn:schemas-microsoft-com:office:word" xmlns:w="http://schemas.openxmlformats.org/wordprocessingml/2006/main" xmlns:w14="http://schemas.microsoft.com/office/word/2010/wordml" xmlns:w15="http://schemas.microsoft.com/office/word/2012/wordml" xmlns:w16cid="http://schemas.microsoft.com/office/word/2016/wordml/cid" xmlns:w16se="http://schemas.microsoft.com/office/word/2015/wordml/symex" xmlns:wpg="http://schemas.microsoft.com/office/word/2010/wordprocessingGroup" xmlns:wpi="http://schemas.microsoft.com/office/word/2010/wordprocessingInk" xmlns:wne="http://schemas.microsoft.com/office/word/2006/wordml" xmlns:wps="http://schemas.microsoft.com/office/word/2010/wordprocessingShape" mc:Ignorable="w14 w15 w16se w16cid wp14">
   <w:abstractNum w:abstractNumId="0" w15:restartNumberingAfterBreak="0">
     <w:nsid w:val="43264846"/>
     <w:multiLevelType w:val="hybridMultilevel"/>
@@ -4593,17 +4683,17 @@
       </w:pPr>
     </w:lvl>
   </w:abstractNum>
-  <w:num w:numId="1" w16cid:durableId="900823403">
+  <w:num w:numId="1">
     <w:abstractNumId w:val="1"/>
   </w:num>
-  <w:num w:numId="2" w16cid:durableId="79252808">
+  <w:num w:numId="2">
     <w:abstractNumId w:val="0"/>
   </w:num>
 </w:numbering>
 </file>
 
 <file path=word/styles.xml><?xml version="1.0" encoding="utf-8"?>
-<w:styles xmlns:mc="http://schemas.openxmlformats.org/markup-compatibility/2006" xmlns:r="http://schemas.openxmlformats.org/officeDocument/2006/relationships" xmlns:w="http://schemas.openxmlformats.org/wordprocessingml/2006/main" xmlns:w14="http://schemas.microsoft.com/office/word/2010/wordml" xmlns:w15="http://schemas.microsoft.com/office/word/2012/wordml" xmlns:w16cex="http://schemas.microsoft.com/office/word/2018/wordml/cex" xmlns:w16cid="http://schemas.microsoft.com/office/word/2016/wordml/cid" xmlns:w16="http://schemas.microsoft.com/office/word/2018/wordml" xmlns:w16du="http://schemas.microsoft.com/office/word/2023/wordml/word16du" xmlns:w16sdtdh="http://schemas.microsoft.com/office/word/2020/wordml/sdtdatahash" xmlns:w16sdtfl="http://schemas.microsoft.com/office/word/2024/wordml/sdtformatlock" xmlns:w16se="http://schemas.microsoft.com/office/word/2015/wordml/symex" mc:Ignorable="w14 w15 w16se w16cid w16 w16cex w16sdtdh w16sdtfl w16du">
+<w:styles xmlns:mc="http://schemas.openxmlformats.org/markup-compatibility/2006" xmlns:r="http://schemas.openxmlformats.org/officeDocument/2006/relationships" xmlns:w="http://schemas.openxmlformats.org/wordprocessingml/2006/main" xmlns:w14="http://schemas.microsoft.com/office/word/2010/wordml" xmlns:w15="http://schemas.microsoft.com/office/word/2012/wordml" xmlns:w16cid="http://schemas.microsoft.com/office/word/2016/wordml/cid" xmlns:w16se="http://schemas.microsoft.com/office/word/2015/wordml/symex" mc:Ignorable="w14 w15 w16se w16cid">
   <w:docDefaults>
     <w:rPrDefault>
       <w:rPr>
@@ -4619,7 +4709,7 @@
       </w:pPr>
     </w:pPrDefault>
   </w:docDefaults>
-  <w:latentStyles w:defLockedState="0" w:defUIPriority="99" w:defSemiHidden="0" w:defUnhideWhenUsed="0" w:defQFormat="0" w:count="376">
+  <w:latentStyles w:defLockedState="0" w:defUIPriority="99" w:defSemiHidden="0" w:defUnhideWhenUsed="0" w:defQFormat="0" w:count="375">
     <w:lsdException w:name="Normal" w:uiPriority="0" w:qFormat="1"/>
     <w:lsdException w:name="heading 1" w:uiPriority="9" w:qFormat="1"/>
     <w:lsdException w:name="heading 2" w:semiHidden="1" w:uiPriority="9" w:unhideWhenUsed="1" w:qFormat="1"/>
@@ -4995,7 +5085,6 @@
     <w:lsdException w:name="Smart Hyperlink" w:semiHidden="1" w:unhideWhenUsed="1"/>
     <w:lsdException w:name="Hashtag" w:semiHidden="1" w:unhideWhenUsed="1"/>
     <w:lsdException w:name="Unresolved Mention" w:semiHidden="1" w:unhideWhenUsed="1"/>
-    <w:lsdException w:name="Smart Link" w:semiHidden="1" w:unhideWhenUsed="1"/>
   </w:latentStyles>
   <w:style w:type="paragraph" w:default="1" w:styleId="Normal">
     <w:name w:val="Normal"/>
@@ -5543,6 +5632,26 @@
 </file>
 
 <file path=customXml/item1.xml><?xml version="1.0" encoding="utf-8"?>
+<?mso-contentType ?>
+<FormTemplates xmlns="http://schemas.microsoft.com/sharepoint/v3/contenttype/forms">
+  <Display>DocumentLibraryForm</Display>
+  <Edit>DocumentLibraryForm</Edit>
+  <New>DocumentLibraryForm</New>
+</FormTemplates>
+</file>
+
+<file path=customXml/item2.xml><?xml version="1.0" encoding="utf-8"?>
+<p:properties xmlns:p="http://schemas.microsoft.com/office/2006/metadata/properties" xmlns:xsi="http://www.w3.org/2001/XMLSchema-instance" xmlns:pc="http://schemas.microsoft.com/office/infopath/2007/PartnerControls">
+  <documentManagement>
+    <TaxCatchAll xmlns="27118ee3-1735-4bf8-b1d8-b92405a04e3d" xsi:nil="true"/>
+    <lcf76f155ced4ddcb4097134ff3c332f xmlns="99f51e6f-0b5b-434c-9b36-ed35023571bc">
+      <Terms xmlns="http://schemas.microsoft.com/office/infopath/2007/PartnerControls"/>
+    </lcf76f155ced4ddcb4097134ff3c332f>
+  </documentManagement>
+</p:properties>
+</file>
+
+<file path=customXml/item3.xml><?xml version="1.0" encoding="utf-8"?>
 <ct:contentTypeSchema xmlns:ct="http://schemas.microsoft.com/office/2006/metadata/contentType" xmlns:ma="http://schemas.microsoft.com/office/2006/metadata/properties/metaAttributes" ct:_="" ma:_="" ma:contentTypeName="Documento" ma:contentTypeID="0x010100AFCCB6245C987745891279558BDB0B3B" ma:contentTypeVersion="10" ma:contentTypeDescription="Crear nuevo documento." ma:contentTypeScope="" ma:versionID="db2b1ef01224d0e4c869899219de097e">
   <xsd:schema xmlns:xsd="http://www.w3.org/2001/XMLSchema" xmlns:xs="http://www.w3.org/2001/XMLSchema" xmlns:p="http://schemas.microsoft.com/office/2006/metadata/properties" xmlns:ns2="99f51e6f-0b5b-434c-9b36-ed35023571bc" xmlns:ns3="27118ee3-1735-4bf8-b1d8-b92405a04e3d" targetNamespace="http://schemas.microsoft.com/office/2006/metadata/properties" ma:root="true" ma:fieldsID="0535449ddeeed03297b3b93236c6a265" ns2:_="" ns3:_="">
     <xsd:import namespace="99f51e6f-0b5b-434c-9b36-ed35023571bc"/>
@@ -5731,27 +5840,26 @@
 </ct:contentTypeSchema>
 </file>
 
-<file path=customXml/item2.xml><?xml version="1.0" encoding="utf-8"?>
-<p:properties xmlns:p="http://schemas.microsoft.com/office/2006/metadata/properties" xmlns:xsi="http://www.w3.org/2001/XMLSchema-instance" xmlns:pc="http://schemas.microsoft.com/office/infopath/2007/PartnerControls">
-  <documentManagement>
-    <TaxCatchAll xmlns="27118ee3-1735-4bf8-b1d8-b92405a04e3d" xsi:nil="true"/>
-    <lcf76f155ced4ddcb4097134ff3c332f xmlns="99f51e6f-0b5b-434c-9b36-ed35023571bc">
-      <Terms xmlns="http://schemas.microsoft.com/office/infopath/2007/PartnerControls"/>
-    </lcf76f155ced4ddcb4097134ff3c332f>
-  </documentManagement>
-</p:properties>
+<file path=customXml/itemProps1.xml><?xml version="1.0" encoding="utf-8"?>
+<ds:datastoreItem xmlns:ds="http://schemas.openxmlformats.org/officeDocument/2006/customXml" ds:itemID="{44477994-AD16-4C5E-B397-6F8C2F21346D}">
+  <ds:schemaRefs>
+    <ds:schemaRef ds:uri="http://schemas.microsoft.com/sharepoint/v3/contenttype/forms"/>
+  </ds:schemaRefs>
+</ds:datastoreItem>
 </file>
 
-<file path=customXml/item3.xml><?xml version="1.0" encoding="utf-8"?>
-<?mso-contentType ?>
-<FormTemplates xmlns="http://schemas.microsoft.com/sharepoint/v3/contenttype/forms">
-  <Display>DocumentLibraryForm</Display>
-  <Edit>DocumentLibraryForm</Edit>
-  <New>DocumentLibraryForm</New>
-</FormTemplates>
+<file path=customXml/itemProps2.xml><?xml version="1.0" encoding="utf-8"?>
+<ds:datastoreItem xmlns:ds="http://schemas.openxmlformats.org/officeDocument/2006/customXml" ds:itemID="{F583E58F-83A6-46FB-AA88-DC0931BDA989}">
+  <ds:schemaRefs>
+    <ds:schemaRef ds:uri="http://schemas.microsoft.com/office/2006/metadata/properties"/>
+    <ds:schemaRef ds:uri="http://schemas.microsoft.com/office/infopath/2007/PartnerControls"/>
+    <ds:schemaRef ds:uri="27118ee3-1735-4bf8-b1d8-b92405a04e3d"/>
+    <ds:schemaRef ds:uri="99f51e6f-0b5b-434c-9b36-ed35023571bc"/>
+  </ds:schemaRefs>
+</ds:datastoreItem>
 </file>
 
-<file path=customXml/itemProps1.xml><?xml version="1.0" encoding="utf-8"?>
+<file path=customXml/itemProps3.xml><?xml version="1.0" encoding="utf-8"?>
 <ds:datastoreItem xmlns:ds="http://schemas.openxmlformats.org/officeDocument/2006/customXml" ds:itemID="{0BDD3A80-86CF-4900-80AE-E06463173716}">
   <ds:schemaRefs>
     <ds:schemaRef ds:uri="http://schemas.microsoft.com/office/2006/metadata/contentType"/>
@@ -5768,23 +5876,4 @@
     <ds:schemaRef ds:uri="http://schemas.microsoft.com/internal/obd"/>
   </ds:schemaRefs>
 </ds:datastoreItem>
-</file>
-
-<file path=customXml/itemProps2.xml><?xml version="1.0" encoding="utf-8"?>
-<ds:datastoreItem xmlns:ds="http://schemas.openxmlformats.org/officeDocument/2006/customXml" ds:itemID="{F583E58F-83A6-46FB-AA88-DC0931BDA989}">
-  <ds:schemaRefs>
-    <ds:schemaRef ds:uri="http://schemas.microsoft.com/office/2006/metadata/properties"/>
-    <ds:schemaRef ds:uri="http://schemas.microsoft.com/office/infopath/2007/PartnerControls"/>
-    <ds:schemaRef ds:uri="27118ee3-1735-4bf8-b1d8-b92405a04e3d"/>
-    <ds:schemaRef ds:uri="99f51e6f-0b5b-434c-9b36-ed35023571bc"/>
-  </ds:schemaRefs>
-</ds:datastoreItem>
-</file>
-
-<file path=customXml/itemProps3.xml><?xml version="1.0" encoding="utf-8"?>
-<ds:datastoreItem xmlns:ds="http://schemas.openxmlformats.org/officeDocument/2006/customXml" ds:itemID="{44477994-AD16-4C5E-B397-6F8C2F21346D}">
-  <ds:schemaRefs>
-    <ds:schemaRef ds:uri="http://schemas.microsoft.com/sharepoint/v3/contenttype/forms"/>
-  </ds:schemaRefs>
-</ds:datastoreItem>
 </file>
</xml_diff>